<commit_message>
Math T7 : scènes IA lot 7 (U5 s6-13 complètes + U6 s1-2) ; U5 rebuild 13 scènes
Co-authored-by: arena-agent <297053741+arena-agent@users.noreply.github.com>
</commit_message>
<xml_diff>
--- a/manuel-math-t7/Manuel_Mathematiques_T7_UNITE5.docx
+++ b/manuel-math-t7/Manuel_Mathematiques_T7_UNITE5.docx
@@ -2706,96 +2706,13 @@
     </w:p>
     <w:p>
       <w:pPr>
-        <w:spacing w:after="110" w:line="300"/>
-        <w:jc w:val="both"/>
-      </w:pPr>
-      <w:r>
-        <w:rPr>
-          <w:rFonts w:ascii="Times New Roman" w:cs="Times New Roman" w:eastAsia="Times New Roman" w:hAnsi="Times New Roman"/>
-          <w:b/>
-          <w:bCs/>
-          <w:i w:val="false"/>
-          <w:iCs w:val="false"/>
-          <w:color w:val="2E7D32"/>
-          <w:sz w:val="24"/>
-          <w:szCs w:val="24"/>
-        </w:rPr>
-        <w:t xml:space="preserve">Définition — </w:t>
-      </w:r>
-      <w:r>
-        <w:rPr>
-          <w:rFonts w:ascii="Times New Roman" w:cs="Times New Roman" w:eastAsia="Times New Roman" w:hAnsi="Times New Roman"/>
-          <w:b/>
-          <w:bCs/>
-          <w:i w:val="false"/>
-          <w:iCs w:val="false"/>
-          <w:color w:val="000000"/>
-          <w:sz w:val="24"/>
-          <w:szCs w:val="24"/>
-        </w:rPr>
-        <w:t xml:space="preserve">Convertir une longueur, c’est l’exprimer dans une autre unité. Dans le tableau des longueurs (km, hm, dam, m, dm, cm, mm), chaque unité vaut 10 fois l’unité placée immédiatement à sa droite.</w:t>
-      </w:r>
-    </w:p>
-    <w:p>
-      <w:pPr>
-        <w:spacing w:after="110" w:line="300"/>
-        <w:jc w:val="both"/>
-      </w:pPr>
-      <w:r>
-        <w:rPr>
-          <w:rFonts w:ascii="Times New Roman" w:cs="Times New Roman" w:eastAsia="Times New Roman" w:hAnsi="Times New Roman"/>
-          <w:b/>
-          <w:bCs/>
-          <w:i w:val="false"/>
-          <w:iCs w:val="false"/>
-          <w:color w:val="1F4E79"/>
-          <w:sz w:val="24"/>
-          <w:szCs w:val="24"/>
-        </w:rPr>
-        <w:t xml:space="preserve">Autrement dit : </w:t>
-      </w:r>
-      <w:r>
-        <w:rPr>
-          <w:rFonts w:ascii="Times New Roman" w:cs="Times New Roman" w:eastAsia="Times New Roman" w:hAnsi="Times New Roman"/>
-          <w:b w:val="false"/>
-          <w:bCs w:val="false"/>
-          <w:i w:val="false"/>
-          <w:iCs w:val="false"/>
-          <w:color w:val="000000"/>
-          <w:sz w:val="24"/>
-          <w:szCs w:val="24"/>
-        </w:rPr>
-        <w:t xml:space="preserve">changer d’unité, c’est déplacer la virgule : un rang par colonne du tableau.</w:t>
-      </w:r>
-    </w:p>
-    <w:p>
-      <w:pPr>
-        <w:spacing w:after="110" w:line="300"/>
-        <w:jc w:val="both"/>
-      </w:pPr>
-      <w:r>
-        <w:rPr>
-          <w:rFonts w:ascii="Times New Roman" w:cs="Times New Roman" w:eastAsia="Times New Roman" w:hAnsi="Times New Roman"/>
-          <w:b w:val="false"/>
-          <w:bCs w:val="false"/>
-          <w:i w:val="false"/>
-          <w:iCs w:val="false"/>
-          <w:color w:val="000000"/>
-          <w:sz w:val="24"/>
-          <w:szCs w:val="24"/>
-        </w:rPr>
-        <w:t xml:space="preserve">On place le chiffre des unités de la mesure dans la colonne de son unité, un chiffre par colonne. Pour lire la mesure dans une autre unité, on place la virgule après la colonne de la nouvelle unité, en complétant par des zéros si nécessaire. Ainsi 3,5 km = 3 500 m : la virgule a avancé de trois rangs car il y a trois colonnes de km à m.</w:t>
-      </w:r>
-    </w:p>
-    <w:p>
-      <w:pPr>
         <w:spacing w:after="120" w:before="120"/>
         <w:jc w:val="center"/>
       </w:pPr>
       <w:r>
         <w:drawing>
           <wp:inline distT="0" distB="0" distL="0" distR="0">
-            <wp:extent cx="4762500" cy="2457450"/>
+            <wp:extent cx="4095750" cy="2286000"/>
             <wp:effectExtent t="0" r="0" b="0" l="0"/>
             <wp:docPr id="1" name="" descr="" title=""/>
             <wp:cNvGraphicFramePr>
@@ -2812,6 +2729,135 @@
                   </pic:nvPicPr>
                   <pic:blipFill>
                     <a:blip r:embed="rId9" cstate="none"/>
+                    <a:srcRect/>
+                    <a:stretch>
+                      <a:fillRect/>
+                    </a:stretch>
+                  </pic:blipFill>
+                  <pic:spPr bwMode="auto">
+                    <a:xfrm>
+                      <a:off x="0" y="0"/>
+                      <a:ext cx="4095750" cy="2286000"/>
+                    </a:xfrm>
+                    <a:prstGeom prst="rect">
+                      <a:avLst/>
+                    </a:prstGeom>
+                  </pic:spPr>
+                </pic:pic>
+              </a:graphicData>
+            </a:graphic>
+          </wp:inline>
+        </w:drawing>
+      </w:r>
+    </w:p>
+    <w:p>
+      <w:pPr>
+        <w:spacing w:after="110" w:line="300"/>
+        <w:jc w:val="both"/>
+      </w:pPr>
+      <w:r>
+        <w:rPr>
+          <w:rFonts w:ascii="Times New Roman" w:cs="Times New Roman" w:eastAsia="Times New Roman" w:hAnsi="Times New Roman"/>
+          <w:b/>
+          <w:bCs/>
+          <w:i w:val="false"/>
+          <w:iCs w:val="false"/>
+          <w:color w:val="2E7D32"/>
+          <w:sz w:val="24"/>
+          <w:szCs w:val="24"/>
+        </w:rPr>
+        <w:t xml:space="preserve">Définition — </w:t>
+      </w:r>
+      <w:r>
+        <w:rPr>
+          <w:rFonts w:ascii="Times New Roman" w:cs="Times New Roman" w:eastAsia="Times New Roman" w:hAnsi="Times New Roman"/>
+          <w:b/>
+          <w:bCs/>
+          <w:i w:val="false"/>
+          <w:iCs w:val="false"/>
+          <w:color w:val="000000"/>
+          <w:sz w:val="24"/>
+          <w:szCs w:val="24"/>
+        </w:rPr>
+        <w:t xml:space="preserve">Convertir une longueur, c’est l’exprimer dans une autre unité. Dans le tableau des longueurs (km, hm, dam, m, dm, cm, mm), chaque unité vaut 10 fois l’unité placée immédiatement à sa droite.</w:t>
+      </w:r>
+    </w:p>
+    <w:p>
+      <w:pPr>
+        <w:spacing w:after="110" w:line="300"/>
+        <w:jc w:val="both"/>
+      </w:pPr>
+      <w:r>
+        <w:rPr>
+          <w:rFonts w:ascii="Times New Roman" w:cs="Times New Roman" w:eastAsia="Times New Roman" w:hAnsi="Times New Roman"/>
+          <w:b/>
+          <w:bCs/>
+          <w:i w:val="false"/>
+          <w:iCs w:val="false"/>
+          <w:color w:val="1F4E79"/>
+          <w:sz w:val="24"/>
+          <w:szCs w:val="24"/>
+        </w:rPr>
+        <w:t xml:space="preserve">Autrement dit : </w:t>
+      </w:r>
+      <w:r>
+        <w:rPr>
+          <w:rFonts w:ascii="Times New Roman" w:cs="Times New Roman" w:eastAsia="Times New Roman" w:hAnsi="Times New Roman"/>
+          <w:b w:val="false"/>
+          <w:bCs w:val="false"/>
+          <w:i w:val="false"/>
+          <w:iCs w:val="false"/>
+          <w:color w:val="000000"/>
+          <w:sz w:val="24"/>
+          <w:szCs w:val="24"/>
+        </w:rPr>
+        <w:t xml:space="preserve">changer d’unité, c’est déplacer la virgule : un rang par colonne du tableau.</w:t>
+      </w:r>
+    </w:p>
+    <w:p>
+      <w:pPr>
+        <w:spacing w:after="110" w:line="300"/>
+        <w:jc w:val="both"/>
+      </w:pPr>
+      <w:r>
+        <w:rPr>
+          <w:rFonts w:ascii="Times New Roman" w:cs="Times New Roman" w:eastAsia="Times New Roman" w:hAnsi="Times New Roman"/>
+          <w:b w:val="false"/>
+          <w:bCs w:val="false"/>
+          <w:i w:val="false"/>
+          <w:iCs w:val="false"/>
+          <w:color w:val="000000"/>
+          <w:sz w:val="24"/>
+          <w:szCs w:val="24"/>
+        </w:rPr>
+        <w:t xml:space="preserve">On place le chiffre des unités de la mesure dans la colonne de son unité, un chiffre par colonne. Pour lire la mesure dans une autre unité, on place la virgule après la colonne de la nouvelle unité, en complétant par des zéros si nécessaire. Ainsi 3,5 km = 3 500 m : la virgule a avancé de trois rangs car il y a trois colonnes de km à m.</w:t>
+      </w:r>
+    </w:p>
+    <w:p>
+      <w:pPr>
+        <w:spacing w:after="120" w:before="120"/>
+        <w:jc w:val="center"/>
+      </w:pPr>
+      <w:r>
+        <w:drawing>
+          <wp:inline distT="0" distB="0" distL="0" distR="0">
+            <wp:extent cx="4762500" cy="2457450"/>
+            <wp:effectExtent t="0" r="0" b="0" l="0"/>
+            <wp:docPr id="2" name="" descr="" title=""/>
+            <wp:cNvGraphicFramePr>
+              <a:graphicFrameLocks xmlns:a="http://schemas.openxmlformats.org/drawingml/2006/main" noChangeAspect="1"/>
+            </wp:cNvGraphicFramePr>
+            <a:graphic xmlns:a="http://schemas.openxmlformats.org/drawingml/2006/main">
+              <a:graphicData uri="http://schemas.openxmlformats.org/drawingml/2006/picture">
+                <pic:pic xmlns:pic="http://schemas.openxmlformats.org/drawingml/2006/picture">
+                  <pic:nvPicPr>
+                    <pic:cNvPr id="0" name="" descr=""/>
+                    <pic:cNvPicPr>
+                      <a:picLocks noChangeAspect="1" noChangeArrowheads="1"/>
+                    </pic:cNvPicPr>
+                  </pic:nvPicPr>
+                  <pic:blipFill>
+                    <a:blip r:embed="rId10" cstate="none"/>
                     <a:srcRect/>
                     <a:stretch>
                       <a:fillRect/>
@@ -5555,98 +5601,15 @@
     </w:p>
     <w:p>
       <w:pPr>
-        <w:spacing w:after="110" w:line="300"/>
-        <w:jc w:val="both"/>
-      </w:pPr>
-      <w:r>
-        <w:rPr>
-          <w:rFonts w:ascii="Times New Roman" w:cs="Times New Roman" w:eastAsia="Times New Roman" w:hAnsi="Times New Roman"/>
-          <w:b/>
-          <w:bCs/>
-          <w:i w:val="false"/>
-          <w:iCs w:val="false"/>
-          <w:color w:val="2E7D32"/>
-          <w:sz w:val="24"/>
-          <w:szCs w:val="24"/>
-        </w:rPr>
-        <w:t xml:space="preserve">Définition — </w:t>
-      </w:r>
-      <w:r>
-        <w:rPr>
-          <w:rFonts w:ascii="Times New Roman" w:cs="Times New Roman" w:eastAsia="Times New Roman" w:hAnsi="Times New Roman"/>
-          <w:b/>
-          <w:bCs/>
-          <w:i w:val="false"/>
-          <w:iCs w:val="false"/>
-          <w:color w:val="000000"/>
-          <w:sz w:val="24"/>
-          <w:szCs w:val="24"/>
-        </w:rPr>
-        <w:t xml:space="preserve">Les masses se convertissent comme les longueurs : 1 t = 1 000 kg et 1 kg = 1 000 g. Les durées suivent une règle différente, en base 60 : 1 h = 60 min et 1 min = 60 s.</w:t>
-      </w:r>
-    </w:p>
-    <w:p>
-      <w:pPr>
-        <w:spacing w:after="110" w:line="300"/>
-        <w:jc w:val="both"/>
-      </w:pPr>
-      <w:r>
-        <w:rPr>
-          <w:rFonts w:ascii="Times New Roman" w:cs="Times New Roman" w:eastAsia="Times New Roman" w:hAnsi="Times New Roman"/>
-          <w:b/>
-          <w:bCs/>
-          <w:i w:val="false"/>
-          <w:iCs w:val="false"/>
-          <w:color w:val="1F4E79"/>
-          <w:sz w:val="24"/>
-          <w:szCs w:val="24"/>
-        </w:rPr>
-        <w:t xml:space="preserve">Autrement dit : </w:t>
-      </w:r>
-      <w:r>
-        <w:rPr>
-          <w:rFonts w:ascii="Times New Roman" w:cs="Times New Roman" w:eastAsia="Times New Roman" w:hAnsi="Times New Roman"/>
-          <w:b w:val="false"/>
-          <w:bCs w:val="false"/>
-          <w:i w:val="false"/>
-          <w:iCs w:val="false"/>
-          <w:color w:val="000000"/>
-          <w:sz w:val="24"/>
-          <w:szCs w:val="24"/>
-        </w:rPr>
-        <w:t xml:space="preserve">pour les masses on compte par 1 000 ; pour le temps on compte par 60, jamais par 10 !</w:t>
-      </w:r>
-    </w:p>
-    <w:p>
-      <w:pPr>
-        <w:spacing w:after="110" w:line="300"/>
-        <w:jc w:val="both"/>
-      </w:pPr>
-      <w:r>
-        <w:rPr>
-          <w:rFonts w:ascii="Times New Roman" w:cs="Times New Roman" w:eastAsia="Times New Roman" w:hAnsi="Times New Roman"/>
-          <w:b w:val="false"/>
-          <w:bCs w:val="false"/>
-          <w:i w:val="false"/>
-          <w:iCs w:val="false"/>
-          <w:color w:val="000000"/>
-          <w:sz w:val="24"/>
-          <w:szCs w:val="24"/>
-        </w:rPr>
-        <w:t xml:space="preserve">Le tableau des masses (t, q, kg, hg, dag, g, dg, cg, mg) fonctionne par colonnes de 10, comme celui des longueurs. Les durées, elles, n’entrent pas dans un tableau décimal : pour passer des heures aux minutes on multiplie par 60, des minutes aux secondes on multiplie encore par 60. Donc 1 h = 3 600 s. Pour revenir en arrière, on divise.</w:t>
-      </w:r>
-    </w:p>
-    <w:p>
-      <w:pPr>
         <w:spacing w:after="120" w:before="120"/>
         <w:jc w:val="center"/>
       </w:pPr>
       <w:r>
         <w:drawing>
           <wp:inline distT="0" distB="0" distL="0" distR="0">
-            <wp:extent cx="4762500" cy="1876425"/>
+            <wp:extent cx="4095750" cy="2286000"/>
             <wp:effectExtent t="0" r="0" b="0" l="0"/>
-            <wp:docPr id="2" name="" descr="" title=""/>
+            <wp:docPr id="3" name="" descr="" title=""/>
             <wp:cNvGraphicFramePr>
               <a:graphicFrameLocks xmlns:a="http://schemas.openxmlformats.org/drawingml/2006/main" noChangeAspect="1"/>
             </wp:cNvGraphicFramePr>
@@ -5660,7 +5623,136 @@
                     </pic:cNvPicPr>
                   </pic:nvPicPr>
                   <pic:blipFill>
-                    <a:blip r:embed="rId10" cstate="none"/>
+                    <a:blip r:embed="rId11" cstate="none"/>
+                    <a:srcRect/>
+                    <a:stretch>
+                      <a:fillRect/>
+                    </a:stretch>
+                  </pic:blipFill>
+                  <pic:spPr bwMode="auto">
+                    <a:xfrm>
+                      <a:off x="0" y="0"/>
+                      <a:ext cx="4095750" cy="2286000"/>
+                    </a:xfrm>
+                    <a:prstGeom prst="rect">
+                      <a:avLst/>
+                    </a:prstGeom>
+                  </pic:spPr>
+                </pic:pic>
+              </a:graphicData>
+            </a:graphic>
+          </wp:inline>
+        </w:drawing>
+      </w:r>
+    </w:p>
+    <w:p>
+      <w:pPr>
+        <w:spacing w:after="110" w:line="300"/>
+        <w:jc w:val="both"/>
+      </w:pPr>
+      <w:r>
+        <w:rPr>
+          <w:rFonts w:ascii="Times New Roman" w:cs="Times New Roman" w:eastAsia="Times New Roman" w:hAnsi="Times New Roman"/>
+          <w:b/>
+          <w:bCs/>
+          <w:i w:val="false"/>
+          <w:iCs w:val="false"/>
+          <w:color w:val="2E7D32"/>
+          <w:sz w:val="24"/>
+          <w:szCs w:val="24"/>
+        </w:rPr>
+        <w:t xml:space="preserve">Définition — </w:t>
+      </w:r>
+      <w:r>
+        <w:rPr>
+          <w:rFonts w:ascii="Times New Roman" w:cs="Times New Roman" w:eastAsia="Times New Roman" w:hAnsi="Times New Roman"/>
+          <w:b/>
+          <w:bCs/>
+          <w:i w:val="false"/>
+          <w:iCs w:val="false"/>
+          <w:color w:val="000000"/>
+          <w:sz w:val="24"/>
+          <w:szCs w:val="24"/>
+        </w:rPr>
+        <w:t xml:space="preserve">Les masses se convertissent comme les longueurs : 1 t = 1 000 kg et 1 kg = 1 000 g. Les durées suivent une règle différente, en base 60 : 1 h = 60 min et 1 min = 60 s.</w:t>
+      </w:r>
+    </w:p>
+    <w:p>
+      <w:pPr>
+        <w:spacing w:after="110" w:line="300"/>
+        <w:jc w:val="both"/>
+      </w:pPr>
+      <w:r>
+        <w:rPr>
+          <w:rFonts w:ascii="Times New Roman" w:cs="Times New Roman" w:eastAsia="Times New Roman" w:hAnsi="Times New Roman"/>
+          <w:b/>
+          <w:bCs/>
+          <w:i w:val="false"/>
+          <w:iCs w:val="false"/>
+          <w:color w:val="1F4E79"/>
+          <w:sz w:val="24"/>
+          <w:szCs w:val="24"/>
+        </w:rPr>
+        <w:t xml:space="preserve">Autrement dit : </w:t>
+      </w:r>
+      <w:r>
+        <w:rPr>
+          <w:rFonts w:ascii="Times New Roman" w:cs="Times New Roman" w:eastAsia="Times New Roman" w:hAnsi="Times New Roman"/>
+          <w:b w:val="false"/>
+          <w:bCs w:val="false"/>
+          <w:i w:val="false"/>
+          <w:iCs w:val="false"/>
+          <w:color w:val="000000"/>
+          <w:sz w:val="24"/>
+          <w:szCs w:val="24"/>
+        </w:rPr>
+        <w:t xml:space="preserve">pour les masses on compte par 1 000 ; pour le temps on compte par 60, jamais par 10 !</w:t>
+      </w:r>
+    </w:p>
+    <w:p>
+      <w:pPr>
+        <w:spacing w:after="110" w:line="300"/>
+        <w:jc w:val="both"/>
+      </w:pPr>
+      <w:r>
+        <w:rPr>
+          <w:rFonts w:ascii="Times New Roman" w:cs="Times New Roman" w:eastAsia="Times New Roman" w:hAnsi="Times New Roman"/>
+          <w:b w:val="false"/>
+          <w:bCs w:val="false"/>
+          <w:i w:val="false"/>
+          <w:iCs w:val="false"/>
+          <w:color w:val="000000"/>
+          <w:sz w:val="24"/>
+          <w:szCs w:val="24"/>
+        </w:rPr>
+        <w:t xml:space="preserve">Le tableau des masses (t, q, kg, hg, dag, g, dg, cg, mg) fonctionne par colonnes de 10, comme celui des longueurs. Les durées, elles, n’entrent pas dans un tableau décimal : pour passer des heures aux minutes on multiplie par 60, des minutes aux secondes on multiplie encore par 60. Donc 1 h = 3 600 s. Pour revenir en arrière, on divise.</w:t>
+      </w:r>
+    </w:p>
+    <w:p>
+      <w:pPr>
+        <w:spacing w:after="120" w:before="120"/>
+        <w:jc w:val="center"/>
+      </w:pPr>
+      <w:r>
+        <w:drawing>
+          <wp:inline distT="0" distB="0" distL="0" distR="0">
+            <wp:extent cx="4762500" cy="1876425"/>
+            <wp:effectExtent t="0" r="0" b="0" l="0"/>
+            <wp:docPr id="4" name="" descr="" title=""/>
+            <wp:cNvGraphicFramePr>
+              <a:graphicFrameLocks xmlns:a="http://schemas.openxmlformats.org/drawingml/2006/main" noChangeAspect="1"/>
+            </wp:cNvGraphicFramePr>
+            <a:graphic xmlns:a="http://schemas.openxmlformats.org/drawingml/2006/main">
+              <a:graphicData uri="http://schemas.openxmlformats.org/drawingml/2006/picture">
+                <pic:pic xmlns:pic="http://schemas.openxmlformats.org/drawingml/2006/picture">
+                  <pic:nvPicPr>
+                    <pic:cNvPr id="0" name="" descr=""/>
+                    <pic:cNvPicPr>
+                      <a:picLocks noChangeAspect="1" noChangeArrowheads="1"/>
+                    </pic:cNvPicPr>
+                  </pic:nvPicPr>
+                  <pic:blipFill>
+                    <a:blip r:embed="rId12" cstate="none"/>
                     <a:srcRect/>
                     <a:stretch>
                       <a:fillRect/>
@@ -8404,98 +8496,15 @@
     </w:p>
     <w:p>
       <w:pPr>
-        <w:spacing w:after="110" w:line="300"/>
-        <w:jc w:val="both"/>
-      </w:pPr>
-      <w:r>
-        <w:rPr>
-          <w:rFonts w:ascii="Times New Roman" w:cs="Times New Roman" w:eastAsia="Times New Roman" w:hAnsi="Times New Roman"/>
-          <w:b/>
-          <w:bCs/>
-          <w:i w:val="false"/>
-          <w:iCs w:val="false"/>
-          <w:color w:val="2E7D32"/>
-          <w:sz w:val="24"/>
-          <w:szCs w:val="24"/>
-        </w:rPr>
-        <w:t xml:space="preserve">Définition — </w:t>
-      </w:r>
-      <w:r>
-        <w:rPr>
-          <w:rFonts w:ascii="Times New Roman" w:cs="Times New Roman" w:eastAsia="Times New Roman" w:hAnsi="Times New Roman"/>
-          <w:b/>
-          <w:bCs/>
-          <w:i w:val="false"/>
-          <w:iCs w:val="false"/>
-          <w:color w:val="000000"/>
-          <w:sz w:val="24"/>
-          <w:szCs w:val="24"/>
-        </w:rPr>
-        <w:t xml:space="preserve">Pour additionner ou soustraire des grandeurs, il faut d’abord les exprimer dans la même unité ; on effectue ensuite l’opération sur les nombres, et le résultat garde cette unité.</w:t>
-      </w:r>
-    </w:p>
-    <w:p>
-      <w:pPr>
-        <w:spacing w:after="110" w:line="300"/>
-        <w:jc w:val="both"/>
-      </w:pPr>
-      <w:r>
-        <w:rPr>
-          <w:rFonts w:ascii="Times New Roman" w:cs="Times New Roman" w:eastAsia="Times New Roman" w:hAnsi="Times New Roman"/>
-          <w:b/>
-          <w:bCs/>
-          <w:i w:val="false"/>
-          <w:iCs w:val="false"/>
-          <w:color w:val="1F4E79"/>
-          <w:sz w:val="24"/>
-          <w:szCs w:val="24"/>
-        </w:rPr>
-        <w:t xml:space="preserve">Autrement dit : </w:t>
-      </w:r>
-      <w:r>
-        <w:rPr>
-          <w:rFonts w:ascii="Times New Roman" w:cs="Times New Roman" w:eastAsia="Times New Roman" w:hAnsi="Times New Roman"/>
-          <w:b w:val="false"/>
-          <w:bCs w:val="false"/>
-          <w:i w:val="false"/>
-          <w:iCs w:val="false"/>
-          <w:color w:val="000000"/>
-          <w:sz w:val="24"/>
-          <w:szCs w:val="24"/>
-        </w:rPr>
-        <w:t xml:space="preserve">même unité d’abord, calcul ensuite — jamais l’inverse.</w:t>
-      </w:r>
-    </w:p>
-    <w:p>
-      <w:pPr>
-        <w:spacing w:after="110" w:line="300"/>
-        <w:jc w:val="both"/>
-      </w:pPr>
-      <w:r>
-        <w:rPr>
-          <w:rFonts w:ascii="Times New Roman" w:cs="Times New Roman" w:eastAsia="Times New Roman" w:hAnsi="Times New Roman"/>
-          <w:b w:val="false"/>
-          <w:bCs w:val="false"/>
-          <w:i w:val="false"/>
-          <w:iCs w:val="false"/>
-          <w:color w:val="000000"/>
-          <w:sz w:val="24"/>
-          <w:szCs w:val="24"/>
-        </w:rPr>
-        <w:t xml:space="preserve">On choisit l’unité la plus commode, souvent la plus petite : 2 m 35 cm = 235 cm et 1 m 80 cm = 180 cm, d’où 235 + 180 = 415 cm = 4 m 15 cm. La même règle vaut pour les masses et les durées : 1 h 40 min + 50 min = 100 min + 50 min = 150 min = 2 h 30 min, car au-delà de 60 minutes on forme une heure.</w:t>
-      </w:r>
-    </w:p>
-    <w:p>
-      <w:pPr>
         <w:spacing w:after="120" w:before="120"/>
         <w:jc w:val="center"/>
       </w:pPr>
       <w:r>
         <w:drawing>
           <wp:inline distT="0" distB="0" distL="0" distR="0">
-            <wp:extent cx="4762500" cy="2352675"/>
+            <wp:extent cx="4095750" cy="2286000"/>
             <wp:effectExtent t="0" r="0" b="0" l="0"/>
-            <wp:docPr id="3" name="" descr="" title=""/>
+            <wp:docPr id="5" name="" descr="" title=""/>
             <wp:cNvGraphicFramePr>
               <a:graphicFrameLocks xmlns:a="http://schemas.openxmlformats.org/drawingml/2006/main" noChangeAspect="1"/>
             </wp:cNvGraphicFramePr>
@@ -8509,7 +8518,136 @@
                     </pic:cNvPicPr>
                   </pic:nvPicPr>
                   <pic:blipFill>
-                    <a:blip r:embed="rId11" cstate="none"/>
+                    <a:blip r:embed="rId13" cstate="none"/>
+                    <a:srcRect/>
+                    <a:stretch>
+                      <a:fillRect/>
+                    </a:stretch>
+                  </pic:blipFill>
+                  <pic:spPr bwMode="auto">
+                    <a:xfrm>
+                      <a:off x="0" y="0"/>
+                      <a:ext cx="4095750" cy="2286000"/>
+                    </a:xfrm>
+                    <a:prstGeom prst="rect">
+                      <a:avLst/>
+                    </a:prstGeom>
+                  </pic:spPr>
+                </pic:pic>
+              </a:graphicData>
+            </a:graphic>
+          </wp:inline>
+        </w:drawing>
+      </w:r>
+    </w:p>
+    <w:p>
+      <w:pPr>
+        <w:spacing w:after="110" w:line="300"/>
+        <w:jc w:val="both"/>
+      </w:pPr>
+      <w:r>
+        <w:rPr>
+          <w:rFonts w:ascii="Times New Roman" w:cs="Times New Roman" w:eastAsia="Times New Roman" w:hAnsi="Times New Roman"/>
+          <w:b/>
+          <w:bCs/>
+          <w:i w:val="false"/>
+          <w:iCs w:val="false"/>
+          <w:color w:val="2E7D32"/>
+          <w:sz w:val="24"/>
+          <w:szCs w:val="24"/>
+        </w:rPr>
+        <w:t xml:space="preserve">Définition — </w:t>
+      </w:r>
+      <w:r>
+        <w:rPr>
+          <w:rFonts w:ascii="Times New Roman" w:cs="Times New Roman" w:eastAsia="Times New Roman" w:hAnsi="Times New Roman"/>
+          <w:b/>
+          <w:bCs/>
+          <w:i w:val="false"/>
+          <w:iCs w:val="false"/>
+          <w:color w:val="000000"/>
+          <w:sz w:val="24"/>
+          <w:szCs w:val="24"/>
+        </w:rPr>
+        <w:t xml:space="preserve">Pour additionner ou soustraire des grandeurs, il faut d’abord les exprimer dans la même unité ; on effectue ensuite l’opération sur les nombres, et le résultat garde cette unité.</w:t>
+      </w:r>
+    </w:p>
+    <w:p>
+      <w:pPr>
+        <w:spacing w:after="110" w:line="300"/>
+        <w:jc w:val="both"/>
+      </w:pPr>
+      <w:r>
+        <w:rPr>
+          <w:rFonts w:ascii="Times New Roman" w:cs="Times New Roman" w:eastAsia="Times New Roman" w:hAnsi="Times New Roman"/>
+          <w:b/>
+          <w:bCs/>
+          <w:i w:val="false"/>
+          <w:iCs w:val="false"/>
+          <w:color w:val="1F4E79"/>
+          <w:sz w:val="24"/>
+          <w:szCs w:val="24"/>
+        </w:rPr>
+        <w:t xml:space="preserve">Autrement dit : </w:t>
+      </w:r>
+      <w:r>
+        <w:rPr>
+          <w:rFonts w:ascii="Times New Roman" w:cs="Times New Roman" w:eastAsia="Times New Roman" w:hAnsi="Times New Roman"/>
+          <w:b w:val="false"/>
+          <w:bCs w:val="false"/>
+          <w:i w:val="false"/>
+          <w:iCs w:val="false"/>
+          <w:color w:val="000000"/>
+          <w:sz w:val="24"/>
+          <w:szCs w:val="24"/>
+        </w:rPr>
+        <w:t xml:space="preserve">même unité d’abord, calcul ensuite — jamais l’inverse.</w:t>
+      </w:r>
+    </w:p>
+    <w:p>
+      <w:pPr>
+        <w:spacing w:after="110" w:line="300"/>
+        <w:jc w:val="both"/>
+      </w:pPr>
+      <w:r>
+        <w:rPr>
+          <w:rFonts w:ascii="Times New Roman" w:cs="Times New Roman" w:eastAsia="Times New Roman" w:hAnsi="Times New Roman"/>
+          <w:b w:val="false"/>
+          <w:bCs w:val="false"/>
+          <w:i w:val="false"/>
+          <w:iCs w:val="false"/>
+          <w:color w:val="000000"/>
+          <w:sz w:val="24"/>
+          <w:szCs w:val="24"/>
+        </w:rPr>
+        <w:t xml:space="preserve">On choisit l’unité la plus commode, souvent la plus petite : 2 m 35 cm = 235 cm et 1 m 80 cm = 180 cm, d’où 235 + 180 = 415 cm = 4 m 15 cm. La même règle vaut pour les masses et les durées : 1 h 40 min + 50 min = 100 min + 50 min = 150 min = 2 h 30 min, car au-delà de 60 minutes on forme une heure.</w:t>
+      </w:r>
+    </w:p>
+    <w:p>
+      <w:pPr>
+        <w:spacing w:after="120" w:before="120"/>
+        <w:jc w:val="center"/>
+      </w:pPr>
+      <w:r>
+        <w:drawing>
+          <wp:inline distT="0" distB="0" distL="0" distR="0">
+            <wp:extent cx="4762500" cy="2352675"/>
+            <wp:effectExtent t="0" r="0" b="0" l="0"/>
+            <wp:docPr id="6" name="" descr="" title=""/>
+            <wp:cNvGraphicFramePr>
+              <a:graphicFrameLocks xmlns:a="http://schemas.openxmlformats.org/drawingml/2006/main" noChangeAspect="1"/>
+            </wp:cNvGraphicFramePr>
+            <a:graphic xmlns:a="http://schemas.openxmlformats.org/drawingml/2006/main">
+              <a:graphicData uri="http://schemas.openxmlformats.org/drawingml/2006/picture">
+                <pic:pic xmlns:pic="http://schemas.openxmlformats.org/drawingml/2006/picture">
+                  <pic:nvPicPr>
+                    <pic:cNvPr id="0" name="" descr=""/>
+                    <pic:cNvPicPr>
+                      <a:picLocks noChangeAspect="1" noChangeArrowheads="1"/>
+                    </pic:cNvPicPr>
+                  </pic:nvPicPr>
+                  <pic:blipFill>
+                    <a:blip r:embed="rId14" cstate="none"/>
                     <a:srcRect/>
                     <a:stretch>
                       <a:fillRect/>
@@ -11253,98 +11391,15 @@
     </w:p>
     <w:p>
       <w:pPr>
-        <w:spacing w:after="110" w:line="300"/>
-        <w:jc w:val="both"/>
-      </w:pPr>
-      <w:r>
-        <w:rPr>
-          <w:rFonts w:ascii="Times New Roman" w:cs="Times New Roman" w:eastAsia="Times New Roman" w:hAnsi="Times New Roman"/>
-          <w:b/>
-          <w:bCs/>
-          <w:i w:val="false"/>
-          <w:iCs w:val="false"/>
-          <w:color w:val="2E7D32"/>
-          <w:sz w:val="24"/>
-          <w:szCs w:val="24"/>
-        </w:rPr>
-        <w:t xml:space="preserve">Définition — </w:t>
-      </w:r>
-      <w:r>
-        <w:rPr>
-          <w:rFonts w:ascii="Times New Roman" w:cs="Times New Roman" w:eastAsia="Times New Roman" w:hAnsi="Times New Roman"/>
-          <w:b/>
-          <w:bCs/>
-          <w:i w:val="false"/>
-          <w:iCs w:val="false"/>
-          <w:color w:val="000000"/>
-          <w:sz w:val="24"/>
-          <w:szCs w:val="24"/>
-        </w:rPr>
-        <w:t xml:space="preserve">Résoudre un problème de grandeurs, c’est traduire la situation en opérations sur des mesures : on identifie les données et la question, on convertit dans la même unité, on calcule, puis on répond par une phrase avec l’unité.</w:t>
-      </w:r>
-    </w:p>
-    <w:p>
-      <w:pPr>
-        <w:spacing w:after="110" w:line="300"/>
-        <w:jc w:val="both"/>
-      </w:pPr>
-      <w:r>
-        <w:rPr>
-          <w:rFonts w:ascii="Times New Roman" w:cs="Times New Roman" w:eastAsia="Times New Roman" w:hAnsi="Times New Roman"/>
-          <w:b/>
-          <w:bCs/>
-          <w:i w:val="false"/>
-          <w:iCs w:val="false"/>
-          <w:color w:val="1F4E79"/>
-          <w:sz w:val="24"/>
-          <w:szCs w:val="24"/>
-        </w:rPr>
-        <w:t xml:space="preserve">Autrement dit : </w:t>
-      </w:r>
-      <w:r>
-        <w:rPr>
-          <w:rFonts w:ascii="Times New Roman" w:cs="Times New Roman" w:eastAsia="Times New Roman" w:hAnsi="Times New Roman"/>
-          <w:b w:val="false"/>
-          <w:bCs w:val="false"/>
-          <w:i w:val="false"/>
-          <w:iCs w:val="false"/>
-          <w:color w:val="000000"/>
-          <w:sz w:val="24"/>
-          <w:szCs w:val="24"/>
-        </w:rPr>
-        <w:t xml:space="preserve">données → même unité → calcul → phrase réponse avec l’unité.</w:t>
-      </w:r>
-    </w:p>
-    <w:p>
-      <w:pPr>
-        <w:spacing w:after="110" w:line="300"/>
-        <w:jc w:val="both"/>
-      </w:pPr>
-      <w:r>
-        <w:rPr>
-          <w:rFonts w:ascii="Times New Roman" w:cs="Times New Roman" w:eastAsia="Times New Roman" w:hAnsi="Times New Roman"/>
-          <w:b w:val="false"/>
-          <w:bCs w:val="false"/>
-          <w:i w:val="false"/>
-          <w:iCs w:val="false"/>
-          <w:color w:val="000000"/>
-          <w:sz w:val="24"/>
-          <w:szCs w:val="24"/>
-        </w:rPr>
-        <w:t xml:space="preserve">La démarche est toujours la même, quelle que soit la grandeur : distance, masse, durée ou contenance. Pour Naina : 1,2 km = 1 200 m, puis 1 200 + 850 = 2 050 m = 2,05 km. La phrase réponse donne le résultat dans l’unité la plus parlante : « Naina parcourt 2,05 km. » Un résultat sans unité ne veut rien dire.</w:t>
-      </w:r>
-    </w:p>
-    <w:p>
-      <w:pPr>
         <w:spacing w:after="120" w:before="120"/>
         <w:jc w:val="center"/>
       </w:pPr>
       <w:r>
         <w:drawing>
           <wp:inline distT="0" distB="0" distL="0" distR="0">
-            <wp:extent cx="4762500" cy="1885950"/>
+            <wp:extent cx="4095750" cy="2286000"/>
             <wp:effectExtent t="0" r="0" b="0" l="0"/>
-            <wp:docPr id="4" name="" descr="" title=""/>
+            <wp:docPr id="7" name="" descr="" title=""/>
             <wp:cNvGraphicFramePr>
               <a:graphicFrameLocks xmlns:a="http://schemas.openxmlformats.org/drawingml/2006/main" noChangeAspect="1"/>
             </wp:cNvGraphicFramePr>
@@ -11358,7 +11413,136 @@
                     </pic:cNvPicPr>
                   </pic:nvPicPr>
                   <pic:blipFill>
-                    <a:blip r:embed="rId12" cstate="none"/>
+                    <a:blip r:embed="rId15" cstate="none"/>
+                    <a:srcRect/>
+                    <a:stretch>
+                      <a:fillRect/>
+                    </a:stretch>
+                  </pic:blipFill>
+                  <pic:spPr bwMode="auto">
+                    <a:xfrm>
+                      <a:off x="0" y="0"/>
+                      <a:ext cx="4095750" cy="2286000"/>
+                    </a:xfrm>
+                    <a:prstGeom prst="rect">
+                      <a:avLst/>
+                    </a:prstGeom>
+                  </pic:spPr>
+                </pic:pic>
+              </a:graphicData>
+            </a:graphic>
+          </wp:inline>
+        </w:drawing>
+      </w:r>
+    </w:p>
+    <w:p>
+      <w:pPr>
+        <w:spacing w:after="110" w:line="300"/>
+        <w:jc w:val="both"/>
+      </w:pPr>
+      <w:r>
+        <w:rPr>
+          <w:rFonts w:ascii="Times New Roman" w:cs="Times New Roman" w:eastAsia="Times New Roman" w:hAnsi="Times New Roman"/>
+          <w:b/>
+          <w:bCs/>
+          <w:i w:val="false"/>
+          <w:iCs w:val="false"/>
+          <w:color w:val="2E7D32"/>
+          <w:sz w:val="24"/>
+          <w:szCs w:val="24"/>
+        </w:rPr>
+        <w:t xml:space="preserve">Définition — </w:t>
+      </w:r>
+      <w:r>
+        <w:rPr>
+          <w:rFonts w:ascii="Times New Roman" w:cs="Times New Roman" w:eastAsia="Times New Roman" w:hAnsi="Times New Roman"/>
+          <w:b/>
+          <w:bCs/>
+          <w:i w:val="false"/>
+          <w:iCs w:val="false"/>
+          <w:color w:val="000000"/>
+          <w:sz w:val="24"/>
+          <w:szCs w:val="24"/>
+        </w:rPr>
+        <w:t xml:space="preserve">Résoudre un problème de grandeurs, c’est traduire la situation en opérations sur des mesures : on identifie les données et la question, on convertit dans la même unité, on calcule, puis on répond par une phrase avec l’unité.</w:t>
+      </w:r>
+    </w:p>
+    <w:p>
+      <w:pPr>
+        <w:spacing w:after="110" w:line="300"/>
+        <w:jc w:val="both"/>
+      </w:pPr>
+      <w:r>
+        <w:rPr>
+          <w:rFonts w:ascii="Times New Roman" w:cs="Times New Roman" w:eastAsia="Times New Roman" w:hAnsi="Times New Roman"/>
+          <w:b/>
+          <w:bCs/>
+          <w:i w:val="false"/>
+          <w:iCs w:val="false"/>
+          <w:color w:val="1F4E79"/>
+          <w:sz w:val="24"/>
+          <w:szCs w:val="24"/>
+        </w:rPr>
+        <w:t xml:space="preserve">Autrement dit : </w:t>
+      </w:r>
+      <w:r>
+        <w:rPr>
+          <w:rFonts w:ascii="Times New Roman" w:cs="Times New Roman" w:eastAsia="Times New Roman" w:hAnsi="Times New Roman"/>
+          <w:b w:val="false"/>
+          <w:bCs w:val="false"/>
+          <w:i w:val="false"/>
+          <w:iCs w:val="false"/>
+          <w:color w:val="000000"/>
+          <w:sz w:val="24"/>
+          <w:szCs w:val="24"/>
+        </w:rPr>
+        <w:t xml:space="preserve">données → même unité → calcul → phrase réponse avec l’unité.</w:t>
+      </w:r>
+    </w:p>
+    <w:p>
+      <w:pPr>
+        <w:spacing w:after="110" w:line="300"/>
+        <w:jc w:val="both"/>
+      </w:pPr>
+      <w:r>
+        <w:rPr>
+          <w:rFonts w:ascii="Times New Roman" w:cs="Times New Roman" w:eastAsia="Times New Roman" w:hAnsi="Times New Roman"/>
+          <w:b w:val="false"/>
+          <w:bCs w:val="false"/>
+          <w:i w:val="false"/>
+          <w:iCs w:val="false"/>
+          <w:color w:val="000000"/>
+          <w:sz w:val="24"/>
+          <w:szCs w:val="24"/>
+        </w:rPr>
+        <w:t xml:space="preserve">La démarche est toujours la même, quelle que soit la grandeur : distance, masse, durée ou contenance. Pour Naina : 1,2 km = 1 200 m, puis 1 200 + 850 = 2 050 m = 2,05 km. La phrase réponse donne le résultat dans l’unité la plus parlante : « Naina parcourt 2,05 km. » Un résultat sans unité ne veut rien dire.</w:t>
+      </w:r>
+    </w:p>
+    <w:p>
+      <w:pPr>
+        <w:spacing w:after="120" w:before="120"/>
+        <w:jc w:val="center"/>
+      </w:pPr>
+      <w:r>
+        <w:drawing>
+          <wp:inline distT="0" distB="0" distL="0" distR="0">
+            <wp:extent cx="4762500" cy="1885950"/>
+            <wp:effectExtent t="0" r="0" b="0" l="0"/>
+            <wp:docPr id="8" name="" descr="" title=""/>
+            <wp:cNvGraphicFramePr>
+              <a:graphicFrameLocks xmlns:a="http://schemas.openxmlformats.org/drawingml/2006/main" noChangeAspect="1"/>
+            </wp:cNvGraphicFramePr>
+            <a:graphic xmlns:a="http://schemas.openxmlformats.org/drawingml/2006/main">
+              <a:graphicData uri="http://schemas.openxmlformats.org/drawingml/2006/picture">
+                <pic:pic xmlns:pic="http://schemas.openxmlformats.org/drawingml/2006/picture">
+                  <pic:nvPicPr>
+                    <pic:cNvPr id="0" name="" descr=""/>
+                    <pic:cNvPicPr>
+                      <a:picLocks noChangeAspect="1" noChangeArrowheads="1"/>
+                    </pic:cNvPicPr>
+                  </pic:nvPicPr>
+                  <pic:blipFill>
+                    <a:blip r:embed="rId16" cstate="none"/>
                     <a:srcRect/>
                     <a:stretch>
                       <a:fillRect/>
@@ -14102,98 +14286,15 @@
     </w:p>
     <w:p>
       <w:pPr>
-        <w:spacing w:after="110" w:line="300"/>
-        <w:jc w:val="both"/>
-      </w:pPr>
-      <w:r>
-        <w:rPr>
-          <w:rFonts w:ascii="Times New Roman" w:cs="Times New Roman" w:eastAsia="Times New Roman" w:hAnsi="Times New Roman"/>
-          <w:b/>
-          <w:bCs/>
-          <w:i w:val="false"/>
-          <w:iCs w:val="false"/>
-          <w:color w:val="2E7D32"/>
-          <w:sz w:val="24"/>
-          <w:szCs w:val="24"/>
-        </w:rPr>
-        <w:t xml:space="preserve">Définition — </w:t>
-      </w:r>
-      <w:r>
-        <w:rPr>
-          <w:rFonts w:ascii="Times New Roman" w:cs="Times New Roman" w:eastAsia="Times New Roman" w:hAnsi="Times New Roman"/>
-          <w:b/>
-          <w:bCs/>
-          <w:i w:val="false"/>
-          <w:iCs w:val="false"/>
-          <w:color w:val="000000"/>
-          <w:sz w:val="24"/>
-          <w:szCs w:val="24"/>
-        </w:rPr>
-        <w:t xml:space="preserve">Le périmètre d’un polygone est la longueur totale de son contour : c’est la somme des longueurs de tous ses côtés. Pour le carré de côté c : P = 4 × c ; pour le rectangle de longueur L et de largeur l : P = 2 × (L + l).</w:t>
-      </w:r>
-    </w:p>
-    <w:p>
-      <w:pPr>
-        <w:spacing w:after="110" w:line="300"/>
-        <w:jc w:val="both"/>
-      </w:pPr>
-      <w:r>
-        <w:rPr>
-          <w:rFonts w:ascii="Times New Roman" w:cs="Times New Roman" w:eastAsia="Times New Roman" w:hAnsi="Times New Roman"/>
-          <w:b/>
-          <w:bCs/>
-          <w:i w:val="false"/>
-          <w:iCs w:val="false"/>
-          <w:color w:val="1F4E79"/>
-          <w:sz w:val="24"/>
-          <w:szCs w:val="24"/>
-        </w:rPr>
-        <w:t xml:space="preserve">Autrement dit : </w:t>
-      </w:r>
-      <w:r>
-        <w:rPr>
-          <w:rFonts w:ascii="Times New Roman" w:cs="Times New Roman" w:eastAsia="Times New Roman" w:hAnsi="Times New Roman"/>
-          <w:b w:val="false"/>
-          <w:bCs w:val="false"/>
-          <w:i w:val="false"/>
-          <w:iCs w:val="false"/>
-          <w:color w:val="000000"/>
-          <w:sz w:val="24"/>
-          <w:szCs w:val="24"/>
-        </w:rPr>
-        <w:t xml:space="preserve">le périmètre, c’est la distance parcourue si l’on fait le tour complet de la figure en marchant sur ses bords.</w:t>
-      </w:r>
-    </w:p>
-    <w:p>
-      <w:pPr>
-        <w:spacing w:after="110" w:line="300"/>
-        <w:jc w:val="both"/>
-      </w:pPr>
-      <w:r>
-        <w:rPr>
-          <w:rFonts w:ascii="Times New Roman" w:cs="Times New Roman" w:eastAsia="Times New Roman" w:hAnsi="Times New Roman"/>
-          <w:b w:val="false"/>
-          <w:bCs w:val="false"/>
-          <w:i w:val="false"/>
-          <w:iCs w:val="false"/>
-          <w:color w:val="000000"/>
-          <w:sz w:val="24"/>
-          <w:szCs w:val="24"/>
-        </w:rPr>
-        <w:t xml:space="preserve">Un périmètre est une longueur : il s’exprime en m, cm, km… Les formules ne sont que des raccourcis de l’addition des côtés : le carré a 4 côtés égaux, d’où 4c ; le rectangle a deux longueurs et deux largeurs, d’où 2L + 2l = 2(L + l). Pour un polygone quelconque, on additionne simplement tous les côtés, après les avoir mis dans la même unité.</w:t>
-      </w:r>
-    </w:p>
-    <w:p>
-      <w:pPr>
         <w:spacing w:after="120" w:before="120"/>
         <w:jc w:val="center"/>
       </w:pPr>
       <w:r>
         <w:drawing>
           <wp:inline distT="0" distB="0" distL="0" distR="0">
-            <wp:extent cx="4762500" cy="2019300"/>
+            <wp:extent cx="4095750" cy="2286000"/>
             <wp:effectExtent t="0" r="0" b="0" l="0"/>
-            <wp:docPr id="5" name="" descr="" title=""/>
+            <wp:docPr id="9" name="" descr="" title=""/>
             <wp:cNvGraphicFramePr>
               <a:graphicFrameLocks xmlns:a="http://schemas.openxmlformats.org/drawingml/2006/main" noChangeAspect="1"/>
             </wp:cNvGraphicFramePr>
@@ -14207,7 +14308,136 @@
                     </pic:cNvPicPr>
                   </pic:nvPicPr>
                   <pic:blipFill>
-                    <a:blip r:embed="rId13" cstate="none"/>
+                    <a:blip r:embed="rId17" cstate="none"/>
+                    <a:srcRect/>
+                    <a:stretch>
+                      <a:fillRect/>
+                    </a:stretch>
+                  </pic:blipFill>
+                  <pic:spPr bwMode="auto">
+                    <a:xfrm>
+                      <a:off x="0" y="0"/>
+                      <a:ext cx="4095750" cy="2286000"/>
+                    </a:xfrm>
+                    <a:prstGeom prst="rect">
+                      <a:avLst/>
+                    </a:prstGeom>
+                  </pic:spPr>
+                </pic:pic>
+              </a:graphicData>
+            </a:graphic>
+          </wp:inline>
+        </w:drawing>
+      </w:r>
+    </w:p>
+    <w:p>
+      <w:pPr>
+        <w:spacing w:after="110" w:line="300"/>
+        <w:jc w:val="both"/>
+      </w:pPr>
+      <w:r>
+        <w:rPr>
+          <w:rFonts w:ascii="Times New Roman" w:cs="Times New Roman" w:eastAsia="Times New Roman" w:hAnsi="Times New Roman"/>
+          <w:b/>
+          <w:bCs/>
+          <w:i w:val="false"/>
+          <w:iCs w:val="false"/>
+          <w:color w:val="2E7D32"/>
+          <w:sz w:val="24"/>
+          <w:szCs w:val="24"/>
+        </w:rPr>
+        <w:t xml:space="preserve">Définition — </w:t>
+      </w:r>
+      <w:r>
+        <w:rPr>
+          <w:rFonts w:ascii="Times New Roman" w:cs="Times New Roman" w:eastAsia="Times New Roman" w:hAnsi="Times New Roman"/>
+          <w:b/>
+          <w:bCs/>
+          <w:i w:val="false"/>
+          <w:iCs w:val="false"/>
+          <w:color w:val="000000"/>
+          <w:sz w:val="24"/>
+          <w:szCs w:val="24"/>
+        </w:rPr>
+        <w:t xml:space="preserve">Le périmètre d’un polygone est la longueur totale de son contour : c’est la somme des longueurs de tous ses côtés. Pour le carré de côté c : P = 4 × c ; pour le rectangle de longueur L et de largeur l : P = 2 × (L + l).</w:t>
+      </w:r>
+    </w:p>
+    <w:p>
+      <w:pPr>
+        <w:spacing w:after="110" w:line="300"/>
+        <w:jc w:val="both"/>
+      </w:pPr>
+      <w:r>
+        <w:rPr>
+          <w:rFonts w:ascii="Times New Roman" w:cs="Times New Roman" w:eastAsia="Times New Roman" w:hAnsi="Times New Roman"/>
+          <w:b/>
+          <w:bCs/>
+          <w:i w:val="false"/>
+          <w:iCs w:val="false"/>
+          <w:color w:val="1F4E79"/>
+          <w:sz w:val="24"/>
+          <w:szCs w:val="24"/>
+        </w:rPr>
+        <w:t xml:space="preserve">Autrement dit : </w:t>
+      </w:r>
+      <w:r>
+        <w:rPr>
+          <w:rFonts w:ascii="Times New Roman" w:cs="Times New Roman" w:eastAsia="Times New Roman" w:hAnsi="Times New Roman"/>
+          <w:b w:val="false"/>
+          <w:bCs w:val="false"/>
+          <w:i w:val="false"/>
+          <w:iCs w:val="false"/>
+          <w:color w:val="000000"/>
+          <w:sz w:val="24"/>
+          <w:szCs w:val="24"/>
+        </w:rPr>
+        <w:t xml:space="preserve">le périmètre, c’est la distance parcourue si l’on fait le tour complet de la figure en marchant sur ses bords.</w:t>
+      </w:r>
+    </w:p>
+    <w:p>
+      <w:pPr>
+        <w:spacing w:after="110" w:line="300"/>
+        <w:jc w:val="both"/>
+      </w:pPr>
+      <w:r>
+        <w:rPr>
+          <w:rFonts w:ascii="Times New Roman" w:cs="Times New Roman" w:eastAsia="Times New Roman" w:hAnsi="Times New Roman"/>
+          <w:b w:val="false"/>
+          <w:bCs w:val="false"/>
+          <w:i w:val="false"/>
+          <w:iCs w:val="false"/>
+          <w:color w:val="000000"/>
+          <w:sz w:val="24"/>
+          <w:szCs w:val="24"/>
+        </w:rPr>
+        <w:t xml:space="preserve">Un périmètre est une longueur : il s’exprime en m, cm, km… Les formules ne sont que des raccourcis de l’addition des côtés : le carré a 4 côtés égaux, d’où 4c ; le rectangle a deux longueurs et deux largeurs, d’où 2L + 2l = 2(L + l). Pour un polygone quelconque, on additionne simplement tous les côtés, après les avoir mis dans la même unité.</w:t>
+      </w:r>
+    </w:p>
+    <w:p>
+      <w:pPr>
+        <w:spacing w:after="120" w:before="120"/>
+        <w:jc w:val="center"/>
+      </w:pPr>
+      <w:r>
+        <w:drawing>
+          <wp:inline distT="0" distB="0" distL="0" distR="0">
+            <wp:extent cx="4762500" cy="2019300"/>
+            <wp:effectExtent t="0" r="0" b="0" l="0"/>
+            <wp:docPr id="10" name="" descr="" title=""/>
+            <wp:cNvGraphicFramePr>
+              <a:graphicFrameLocks xmlns:a="http://schemas.openxmlformats.org/drawingml/2006/main" noChangeAspect="1"/>
+            </wp:cNvGraphicFramePr>
+            <a:graphic xmlns:a="http://schemas.openxmlformats.org/drawingml/2006/main">
+              <a:graphicData uri="http://schemas.openxmlformats.org/drawingml/2006/picture">
+                <pic:pic xmlns:pic="http://schemas.openxmlformats.org/drawingml/2006/picture">
+                  <pic:nvPicPr>
+                    <pic:cNvPr id="0" name="" descr=""/>
+                    <pic:cNvPicPr>
+                      <a:picLocks noChangeAspect="1" noChangeArrowheads="1"/>
+                    </pic:cNvPicPr>
+                  </pic:nvPicPr>
+                  <pic:blipFill>
+                    <a:blip r:embed="rId18" cstate="none"/>
                     <a:srcRect/>
                     <a:stretch>
                       <a:fillRect/>
@@ -16951,98 +17181,15 @@
     </w:p>
     <w:p>
       <w:pPr>
-        <w:spacing w:after="110" w:line="300"/>
-        <w:jc w:val="both"/>
-      </w:pPr>
-      <w:r>
-        <w:rPr>
-          <w:rFonts w:ascii="Times New Roman" w:cs="Times New Roman" w:eastAsia="Times New Roman" w:hAnsi="Times New Roman"/>
-          <w:b/>
-          <w:bCs/>
-          <w:i w:val="false"/>
-          <w:iCs w:val="false"/>
-          <w:color w:val="2E7D32"/>
-          <w:sz w:val="24"/>
-          <w:szCs w:val="24"/>
-        </w:rPr>
-        <w:t xml:space="preserve">Définition — </w:t>
-      </w:r>
-      <w:r>
-        <w:rPr>
-          <w:rFonts w:ascii="Times New Roman" w:cs="Times New Roman" w:eastAsia="Times New Roman" w:hAnsi="Times New Roman"/>
-          <w:b/>
-          <w:bCs/>
-          <w:i w:val="false"/>
-          <w:iCs w:val="false"/>
-          <w:color w:val="000000"/>
-          <w:sz w:val="24"/>
-          <w:szCs w:val="24"/>
-        </w:rPr>
-        <w:t xml:space="preserve">La circonférence d’un cercle est la longueur de son contour. Elle est proportionnelle au diamètre : C = π × d = 2 × π × r, où π (pi) est un nombre constant valant environ 3,14.</w:t>
-      </w:r>
-    </w:p>
-    <w:p>
-      <w:pPr>
-        <w:spacing w:after="110" w:line="300"/>
-        <w:jc w:val="both"/>
-      </w:pPr>
-      <w:r>
-        <w:rPr>
-          <w:rFonts w:ascii="Times New Roman" w:cs="Times New Roman" w:eastAsia="Times New Roman" w:hAnsi="Times New Roman"/>
-          <w:b/>
-          <w:bCs/>
-          <w:i w:val="false"/>
-          <w:iCs w:val="false"/>
-          <w:color w:val="1F4E79"/>
-          <w:sz w:val="24"/>
-          <w:szCs w:val="24"/>
-        </w:rPr>
-        <w:t xml:space="preserve">Autrement dit : </w:t>
-      </w:r>
-      <w:r>
-        <w:rPr>
-          <w:rFonts w:ascii="Times New Roman" w:cs="Times New Roman" w:eastAsia="Times New Roman" w:hAnsi="Times New Roman"/>
-          <w:b w:val="false"/>
-          <w:bCs w:val="false"/>
-          <w:i w:val="false"/>
-          <w:iCs w:val="false"/>
-          <w:color w:val="000000"/>
-          <w:sz w:val="24"/>
-          <w:szCs w:val="24"/>
-        </w:rPr>
-        <w:t xml:space="preserve">le tour d’un cercle vaut toujours un peu plus de 3 fois son diamètre.</w:t>
-      </w:r>
-    </w:p>
-    <w:p>
-      <w:pPr>
-        <w:spacing w:after="110" w:line="300"/>
-        <w:jc w:val="both"/>
-      </w:pPr>
-      <w:r>
-        <w:rPr>
-          <w:rFonts w:ascii="Times New Roman" w:cs="Times New Roman" w:eastAsia="Times New Roman" w:hAnsi="Times New Roman"/>
-          <w:b w:val="false"/>
-          <w:bCs w:val="false"/>
-          <w:i w:val="false"/>
-          <w:iCs w:val="false"/>
-          <w:color w:val="000000"/>
-          <w:sz w:val="24"/>
-          <w:szCs w:val="24"/>
-        </w:rPr>
-        <w:t xml:space="preserve">Quel que soit le cercle — pièce de monnaie ou stade —, le rapport circonférence ÷ diamètre donne toujours le même nombre π ≈ 3,14159… C’est pourquoi une roue de diamètre d avance de π × d à chaque tour complet. Comme d = 2r, on écrit aussi C = 2πr. Dans les calculs du collège, on prend π ≈ 3,14.</w:t>
-      </w:r>
-    </w:p>
-    <w:p>
-      <w:pPr>
         <w:spacing w:after="120" w:before="120"/>
         <w:jc w:val="center"/>
       </w:pPr>
       <w:r>
         <w:drawing>
           <wp:inline distT="0" distB="0" distL="0" distR="0">
-            <wp:extent cx="4762500" cy="2076450"/>
+            <wp:extent cx="4095750" cy="2286000"/>
             <wp:effectExtent t="0" r="0" b="0" l="0"/>
-            <wp:docPr id="6" name="" descr="" title=""/>
+            <wp:docPr id="11" name="" descr="" title=""/>
             <wp:cNvGraphicFramePr>
               <a:graphicFrameLocks xmlns:a="http://schemas.openxmlformats.org/drawingml/2006/main" noChangeAspect="1"/>
             </wp:cNvGraphicFramePr>
@@ -17056,7 +17203,136 @@
                     </pic:cNvPicPr>
                   </pic:nvPicPr>
                   <pic:blipFill>
-                    <a:blip r:embed="rId14" cstate="none"/>
+                    <a:blip r:embed="rId19" cstate="none"/>
+                    <a:srcRect/>
+                    <a:stretch>
+                      <a:fillRect/>
+                    </a:stretch>
+                  </pic:blipFill>
+                  <pic:spPr bwMode="auto">
+                    <a:xfrm>
+                      <a:off x="0" y="0"/>
+                      <a:ext cx="4095750" cy="2286000"/>
+                    </a:xfrm>
+                    <a:prstGeom prst="rect">
+                      <a:avLst/>
+                    </a:prstGeom>
+                  </pic:spPr>
+                </pic:pic>
+              </a:graphicData>
+            </a:graphic>
+          </wp:inline>
+        </w:drawing>
+      </w:r>
+    </w:p>
+    <w:p>
+      <w:pPr>
+        <w:spacing w:after="110" w:line="300"/>
+        <w:jc w:val="both"/>
+      </w:pPr>
+      <w:r>
+        <w:rPr>
+          <w:rFonts w:ascii="Times New Roman" w:cs="Times New Roman" w:eastAsia="Times New Roman" w:hAnsi="Times New Roman"/>
+          <w:b/>
+          <w:bCs/>
+          <w:i w:val="false"/>
+          <w:iCs w:val="false"/>
+          <w:color w:val="2E7D32"/>
+          <w:sz w:val="24"/>
+          <w:szCs w:val="24"/>
+        </w:rPr>
+        <w:t xml:space="preserve">Définition — </w:t>
+      </w:r>
+      <w:r>
+        <w:rPr>
+          <w:rFonts w:ascii="Times New Roman" w:cs="Times New Roman" w:eastAsia="Times New Roman" w:hAnsi="Times New Roman"/>
+          <w:b/>
+          <w:bCs/>
+          <w:i w:val="false"/>
+          <w:iCs w:val="false"/>
+          <w:color w:val="000000"/>
+          <w:sz w:val="24"/>
+          <w:szCs w:val="24"/>
+        </w:rPr>
+        <w:t xml:space="preserve">La circonférence d’un cercle est la longueur de son contour. Elle est proportionnelle au diamètre : C = π × d = 2 × π × r, où π (pi) est un nombre constant valant environ 3,14.</w:t>
+      </w:r>
+    </w:p>
+    <w:p>
+      <w:pPr>
+        <w:spacing w:after="110" w:line="300"/>
+        <w:jc w:val="both"/>
+      </w:pPr>
+      <w:r>
+        <w:rPr>
+          <w:rFonts w:ascii="Times New Roman" w:cs="Times New Roman" w:eastAsia="Times New Roman" w:hAnsi="Times New Roman"/>
+          <w:b/>
+          <w:bCs/>
+          <w:i w:val="false"/>
+          <w:iCs w:val="false"/>
+          <w:color w:val="1F4E79"/>
+          <w:sz w:val="24"/>
+          <w:szCs w:val="24"/>
+        </w:rPr>
+        <w:t xml:space="preserve">Autrement dit : </w:t>
+      </w:r>
+      <w:r>
+        <w:rPr>
+          <w:rFonts w:ascii="Times New Roman" w:cs="Times New Roman" w:eastAsia="Times New Roman" w:hAnsi="Times New Roman"/>
+          <w:b w:val="false"/>
+          <w:bCs w:val="false"/>
+          <w:i w:val="false"/>
+          <w:iCs w:val="false"/>
+          <w:color w:val="000000"/>
+          <w:sz w:val="24"/>
+          <w:szCs w:val="24"/>
+        </w:rPr>
+        <w:t xml:space="preserve">le tour d’un cercle vaut toujours un peu plus de 3 fois son diamètre.</w:t>
+      </w:r>
+    </w:p>
+    <w:p>
+      <w:pPr>
+        <w:spacing w:after="110" w:line="300"/>
+        <w:jc w:val="both"/>
+      </w:pPr>
+      <w:r>
+        <w:rPr>
+          <w:rFonts w:ascii="Times New Roman" w:cs="Times New Roman" w:eastAsia="Times New Roman" w:hAnsi="Times New Roman"/>
+          <w:b w:val="false"/>
+          <w:bCs w:val="false"/>
+          <w:i w:val="false"/>
+          <w:iCs w:val="false"/>
+          <w:color w:val="000000"/>
+          <w:sz w:val="24"/>
+          <w:szCs w:val="24"/>
+        </w:rPr>
+        <w:t xml:space="preserve">Quel que soit le cercle — pièce de monnaie ou stade —, le rapport circonférence ÷ diamètre donne toujours le même nombre π ≈ 3,14159… C’est pourquoi une roue de diamètre d avance de π × d à chaque tour complet. Comme d = 2r, on écrit aussi C = 2πr. Dans les calculs du collège, on prend π ≈ 3,14.</w:t>
+      </w:r>
+    </w:p>
+    <w:p>
+      <w:pPr>
+        <w:spacing w:after="120" w:before="120"/>
+        <w:jc w:val="center"/>
+      </w:pPr>
+      <w:r>
+        <w:drawing>
+          <wp:inline distT="0" distB="0" distL="0" distR="0">
+            <wp:extent cx="4762500" cy="2076450"/>
+            <wp:effectExtent t="0" r="0" b="0" l="0"/>
+            <wp:docPr id="12" name="" descr="" title=""/>
+            <wp:cNvGraphicFramePr>
+              <a:graphicFrameLocks xmlns:a="http://schemas.openxmlformats.org/drawingml/2006/main" noChangeAspect="1"/>
+            </wp:cNvGraphicFramePr>
+            <a:graphic xmlns:a="http://schemas.openxmlformats.org/drawingml/2006/main">
+              <a:graphicData uri="http://schemas.openxmlformats.org/drawingml/2006/picture">
+                <pic:pic xmlns:pic="http://schemas.openxmlformats.org/drawingml/2006/picture">
+                  <pic:nvPicPr>
+                    <pic:cNvPr id="0" name="" descr=""/>
+                    <pic:cNvPicPr>
+                      <a:picLocks noChangeAspect="1" noChangeArrowheads="1"/>
+                    </pic:cNvPicPr>
+                  </pic:nvPicPr>
+                  <pic:blipFill>
+                    <a:blip r:embed="rId20" cstate="none"/>
                     <a:srcRect/>
                     <a:stretch>
                       <a:fillRect/>
@@ -19800,98 +20076,15 @@
     </w:p>
     <w:p>
       <w:pPr>
-        <w:spacing w:after="110" w:line="300"/>
-        <w:jc w:val="both"/>
-      </w:pPr>
-      <w:r>
-        <w:rPr>
-          <w:rFonts w:ascii="Times New Roman" w:cs="Times New Roman" w:eastAsia="Times New Roman" w:hAnsi="Times New Roman"/>
-          <w:b/>
-          <w:bCs/>
-          <w:i w:val="false"/>
-          <w:iCs w:val="false"/>
-          <w:color w:val="2E7D32"/>
-          <w:sz w:val="24"/>
-          <w:szCs w:val="24"/>
-        </w:rPr>
-        <w:t xml:space="preserve">Définition — </w:t>
-      </w:r>
-      <w:r>
-        <w:rPr>
-          <w:rFonts w:ascii="Times New Roman" w:cs="Times New Roman" w:eastAsia="Times New Roman" w:hAnsi="Times New Roman"/>
-          <w:b/>
-          <w:bCs/>
-          <w:i w:val="false"/>
-          <w:iCs w:val="false"/>
-          <w:color w:val="000000"/>
-          <w:sz w:val="24"/>
-          <w:szCs w:val="24"/>
-        </w:rPr>
-        <w:t xml:space="preserve">L’aire d’une figure est la mesure de sa surface, exprimée en unités d’aire (cm², m², km²…). Pour le rectangle : A = L × l ; pour le carré : A = c × c = c².</w:t>
-      </w:r>
-    </w:p>
-    <w:p>
-      <w:pPr>
-        <w:spacing w:after="110" w:line="300"/>
-        <w:jc w:val="both"/>
-      </w:pPr>
-      <w:r>
-        <w:rPr>
-          <w:rFonts w:ascii="Times New Roman" w:cs="Times New Roman" w:eastAsia="Times New Roman" w:hAnsi="Times New Roman"/>
-          <w:b/>
-          <w:bCs/>
-          <w:i w:val="false"/>
-          <w:iCs w:val="false"/>
-          <w:color w:val="1F4E79"/>
-          <w:sz w:val="24"/>
-          <w:szCs w:val="24"/>
-        </w:rPr>
-        <w:t xml:space="preserve">Autrement dit : </w:t>
-      </w:r>
-      <w:r>
-        <w:rPr>
-          <w:rFonts w:ascii="Times New Roman" w:cs="Times New Roman" w:eastAsia="Times New Roman" w:hAnsi="Times New Roman"/>
-          <w:b w:val="false"/>
-          <w:bCs w:val="false"/>
-          <w:i w:val="false"/>
-          <w:iCs w:val="false"/>
-          <w:color w:val="000000"/>
-          <w:sz w:val="24"/>
-          <w:szCs w:val="24"/>
-        </w:rPr>
-        <w:t xml:space="preserve">l’aire, c’est le nombre de carreaux unités qu’il faut pour recouvrir exactement la figure.</w:t>
-      </w:r>
-    </w:p>
-    <w:p>
-      <w:pPr>
-        <w:spacing w:after="110" w:line="300"/>
-        <w:jc w:val="both"/>
-      </w:pPr>
-      <w:r>
-        <w:rPr>
-          <w:rFonts w:ascii="Times New Roman" w:cs="Times New Roman" w:eastAsia="Times New Roman" w:hAnsi="Times New Roman"/>
-          <w:b w:val="false"/>
-          <w:bCs w:val="false"/>
-          <w:i w:val="false"/>
-          <w:iCs w:val="false"/>
-          <w:color w:val="000000"/>
-          <w:sz w:val="24"/>
-          <w:szCs w:val="24"/>
-        </w:rPr>
-        <w:t xml:space="preserve">Sur un quadrillage, le rectangle de 8 carreaux sur 5 contient 8 × 5 = 40 carreaux : la formule A = L × l ne fait que compter les carreaux par rangées. Attention aux unités : si les côtés sont en cm, l’aire est en cm². Et 1 m² = 100 dm² = 10 000 cm² : chaque passage d’unité d’aire multiplie par 100, pas par 10 !</w:t>
-      </w:r>
-    </w:p>
-    <w:p>
-      <w:pPr>
         <w:spacing w:after="120" w:before="120"/>
         <w:jc w:val="center"/>
       </w:pPr>
       <w:r>
         <w:drawing>
           <wp:inline distT="0" distB="0" distL="0" distR="0">
-            <wp:extent cx="4762500" cy="2362200"/>
+            <wp:extent cx="4095750" cy="2286000"/>
             <wp:effectExtent t="0" r="0" b="0" l="0"/>
-            <wp:docPr id="7" name="" descr="" title=""/>
+            <wp:docPr id="13" name="" descr="" title=""/>
             <wp:cNvGraphicFramePr>
               <a:graphicFrameLocks xmlns:a="http://schemas.openxmlformats.org/drawingml/2006/main" noChangeAspect="1"/>
             </wp:cNvGraphicFramePr>
@@ -19905,7 +20098,136 @@
                     </pic:cNvPicPr>
                   </pic:nvPicPr>
                   <pic:blipFill>
-                    <a:blip r:embed="rId15" cstate="none"/>
+                    <a:blip r:embed="rId21" cstate="none"/>
+                    <a:srcRect/>
+                    <a:stretch>
+                      <a:fillRect/>
+                    </a:stretch>
+                  </pic:blipFill>
+                  <pic:spPr bwMode="auto">
+                    <a:xfrm>
+                      <a:off x="0" y="0"/>
+                      <a:ext cx="4095750" cy="2286000"/>
+                    </a:xfrm>
+                    <a:prstGeom prst="rect">
+                      <a:avLst/>
+                    </a:prstGeom>
+                  </pic:spPr>
+                </pic:pic>
+              </a:graphicData>
+            </a:graphic>
+          </wp:inline>
+        </w:drawing>
+      </w:r>
+    </w:p>
+    <w:p>
+      <w:pPr>
+        <w:spacing w:after="110" w:line="300"/>
+        <w:jc w:val="both"/>
+      </w:pPr>
+      <w:r>
+        <w:rPr>
+          <w:rFonts w:ascii="Times New Roman" w:cs="Times New Roman" w:eastAsia="Times New Roman" w:hAnsi="Times New Roman"/>
+          <w:b/>
+          <w:bCs/>
+          <w:i w:val="false"/>
+          <w:iCs w:val="false"/>
+          <w:color w:val="2E7D32"/>
+          <w:sz w:val="24"/>
+          <w:szCs w:val="24"/>
+        </w:rPr>
+        <w:t xml:space="preserve">Définition — </w:t>
+      </w:r>
+      <w:r>
+        <w:rPr>
+          <w:rFonts w:ascii="Times New Roman" w:cs="Times New Roman" w:eastAsia="Times New Roman" w:hAnsi="Times New Roman"/>
+          <w:b/>
+          <w:bCs/>
+          <w:i w:val="false"/>
+          <w:iCs w:val="false"/>
+          <w:color w:val="000000"/>
+          <w:sz w:val="24"/>
+          <w:szCs w:val="24"/>
+        </w:rPr>
+        <w:t xml:space="preserve">L’aire d’une figure est la mesure de sa surface, exprimée en unités d’aire (cm², m², km²…). Pour le rectangle : A = L × l ; pour le carré : A = c × c = c².</w:t>
+      </w:r>
+    </w:p>
+    <w:p>
+      <w:pPr>
+        <w:spacing w:after="110" w:line="300"/>
+        <w:jc w:val="both"/>
+      </w:pPr>
+      <w:r>
+        <w:rPr>
+          <w:rFonts w:ascii="Times New Roman" w:cs="Times New Roman" w:eastAsia="Times New Roman" w:hAnsi="Times New Roman"/>
+          <w:b/>
+          <w:bCs/>
+          <w:i w:val="false"/>
+          <w:iCs w:val="false"/>
+          <w:color w:val="1F4E79"/>
+          <w:sz w:val="24"/>
+          <w:szCs w:val="24"/>
+        </w:rPr>
+        <w:t xml:space="preserve">Autrement dit : </w:t>
+      </w:r>
+      <w:r>
+        <w:rPr>
+          <w:rFonts w:ascii="Times New Roman" w:cs="Times New Roman" w:eastAsia="Times New Roman" w:hAnsi="Times New Roman"/>
+          <w:b w:val="false"/>
+          <w:bCs w:val="false"/>
+          <w:i w:val="false"/>
+          <w:iCs w:val="false"/>
+          <w:color w:val="000000"/>
+          <w:sz w:val="24"/>
+          <w:szCs w:val="24"/>
+        </w:rPr>
+        <w:t xml:space="preserve">l’aire, c’est le nombre de carreaux unités qu’il faut pour recouvrir exactement la figure.</w:t>
+      </w:r>
+    </w:p>
+    <w:p>
+      <w:pPr>
+        <w:spacing w:after="110" w:line="300"/>
+        <w:jc w:val="both"/>
+      </w:pPr>
+      <w:r>
+        <w:rPr>
+          <w:rFonts w:ascii="Times New Roman" w:cs="Times New Roman" w:eastAsia="Times New Roman" w:hAnsi="Times New Roman"/>
+          <w:b w:val="false"/>
+          <w:bCs w:val="false"/>
+          <w:i w:val="false"/>
+          <w:iCs w:val="false"/>
+          <w:color w:val="000000"/>
+          <w:sz w:val="24"/>
+          <w:szCs w:val="24"/>
+        </w:rPr>
+        <w:t xml:space="preserve">Sur un quadrillage, le rectangle de 8 carreaux sur 5 contient 8 × 5 = 40 carreaux : la formule A = L × l ne fait que compter les carreaux par rangées. Attention aux unités : si les côtés sont en cm, l’aire est en cm². Et 1 m² = 100 dm² = 10 000 cm² : chaque passage d’unité d’aire multiplie par 100, pas par 10 !</w:t>
+      </w:r>
+    </w:p>
+    <w:p>
+      <w:pPr>
+        <w:spacing w:after="120" w:before="120"/>
+        <w:jc w:val="center"/>
+      </w:pPr>
+      <w:r>
+        <w:drawing>
+          <wp:inline distT="0" distB="0" distL="0" distR="0">
+            <wp:extent cx="4762500" cy="2362200"/>
+            <wp:effectExtent t="0" r="0" b="0" l="0"/>
+            <wp:docPr id="14" name="" descr="" title=""/>
+            <wp:cNvGraphicFramePr>
+              <a:graphicFrameLocks xmlns:a="http://schemas.openxmlformats.org/drawingml/2006/main" noChangeAspect="1"/>
+            </wp:cNvGraphicFramePr>
+            <a:graphic xmlns:a="http://schemas.openxmlformats.org/drawingml/2006/main">
+              <a:graphicData uri="http://schemas.openxmlformats.org/drawingml/2006/picture">
+                <pic:pic xmlns:pic="http://schemas.openxmlformats.org/drawingml/2006/picture">
+                  <pic:nvPicPr>
+                    <pic:cNvPr id="0" name="" descr=""/>
+                    <pic:cNvPicPr>
+                      <a:picLocks noChangeAspect="1" noChangeArrowheads="1"/>
+                    </pic:cNvPicPr>
+                  </pic:nvPicPr>
+                  <pic:blipFill>
+                    <a:blip r:embed="rId22" cstate="none"/>
                     <a:srcRect/>
                     <a:stretch>
                       <a:fillRect/>
@@ -22649,98 +22971,15 @@
     </w:p>
     <w:p>
       <w:pPr>
-        <w:spacing w:after="110" w:line="300"/>
-        <w:jc w:val="both"/>
-      </w:pPr>
-      <w:r>
-        <w:rPr>
-          <w:rFonts w:ascii="Times New Roman" w:cs="Times New Roman" w:eastAsia="Times New Roman" w:hAnsi="Times New Roman"/>
-          <w:b/>
-          <w:bCs/>
-          <w:i w:val="false"/>
-          <w:iCs w:val="false"/>
-          <w:color w:val="2E7D32"/>
-          <w:sz w:val="24"/>
-          <w:szCs w:val="24"/>
-        </w:rPr>
-        <w:t xml:space="preserve">Définition — </w:t>
-      </w:r>
-      <w:r>
-        <w:rPr>
-          <w:rFonts w:ascii="Times New Roman" w:cs="Times New Roman" w:eastAsia="Times New Roman" w:hAnsi="Times New Roman"/>
-          <w:b/>
-          <w:bCs/>
-          <w:i w:val="false"/>
-          <w:iCs w:val="false"/>
-          <w:color w:val="000000"/>
-          <w:sz w:val="24"/>
-          <w:szCs w:val="24"/>
-        </w:rPr>
-        <w:t xml:space="preserve">L’aire du parallélogramme de base b et de hauteur h est A = b × h. L’aire du triangle est la moitié de celle du parallélogramme de mêmes base et hauteur : A = (b × h) ÷ 2. La hauteur est toujours perpendiculaire à la base.</w:t>
-      </w:r>
-    </w:p>
-    <w:p>
-      <w:pPr>
-        <w:spacing w:after="110" w:line="300"/>
-        <w:jc w:val="both"/>
-      </w:pPr>
-      <w:r>
-        <w:rPr>
-          <w:rFonts w:ascii="Times New Roman" w:cs="Times New Roman" w:eastAsia="Times New Roman" w:hAnsi="Times New Roman"/>
-          <w:b/>
-          <w:bCs/>
-          <w:i w:val="false"/>
-          <w:iCs w:val="false"/>
-          <w:color w:val="1F4E79"/>
-          <w:sz w:val="24"/>
-          <w:szCs w:val="24"/>
-        </w:rPr>
-        <w:t xml:space="preserve">Autrement dit : </w:t>
-      </w:r>
-      <w:r>
-        <w:rPr>
-          <w:rFonts w:ascii="Times New Roman" w:cs="Times New Roman" w:eastAsia="Times New Roman" w:hAnsi="Times New Roman"/>
-          <w:b w:val="false"/>
-          <w:bCs w:val="false"/>
-          <w:i w:val="false"/>
-          <w:iCs w:val="false"/>
-          <w:color w:val="000000"/>
-          <w:sz w:val="24"/>
-          <w:szCs w:val="24"/>
-        </w:rPr>
-        <w:t xml:space="preserve">parallélogramme : comme un rectangle penché, base fois hauteur ; triangle : la moitié.</w:t>
-      </w:r>
-    </w:p>
-    <w:p>
-      <w:pPr>
-        <w:spacing w:after="110" w:line="300"/>
-        <w:jc w:val="both"/>
-      </w:pPr>
-      <w:r>
-        <w:rPr>
-          <w:rFonts w:ascii="Times New Roman" w:cs="Times New Roman" w:eastAsia="Times New Roman" w:hAnsi="Times New Roman"/>
-          <w:b w:val="false"/>
-          <w:bCs w:val="false"/>
-          <w:i w:val="false"/>
-          <w:iCs w:val="false"/>
-          <w:color w:val="000000"/>
-          <w:sz w:val="24"/>
-          <w:szCs w:val="24"/>
-        </w:rPr>
-        <w:t xml:space="preserve">Le découpage-recollage montre que le parallélogramme a la même aire que le rectangle de côtés b et h : d’où A = b × h. La diagonale d’un parallélogramme le partage en deux triangles superposables, donc chaque triangle vaut (b × h) ÷ 2. Attention : h est la hauteur perpendiculaire, pas le côté penché !</w:t>
-      </w:r>
-    </w:p>
-    <w:p>
-      <w:pPr>
         <w:spacing w:after="120" w:before="120"/>
         <w:jc w:val="center"/>
       </w:pPr>
       <w:r>
         <w:drawing>
           <wp:inline distT="0" distB="0" distL="0" distR="0">
-            <wp:extent cx="4762500" cy="2162175"/>
+            <wp:extent cx="4095750" cy="2286000"/>
             <wp:effectExtent t="0" r="0" b="0" l="0"/>
-            <wp:docPr id="8" name="" descr="" title=""/>
+            <wp:docPr id="15" name="" descr="" title=""/>
             <wp:cNvGraphicFramePr>
               <a:graphicFrameLocks xmlns:a="http://schemas.openxmlformats.org/drawingml/2006/main" noChangeAspect="1"/>
             </wp:cNvGraphicFramePr>
@@ -22754,7 +22993,136 @@
                     </pic:cNvPicPr>
                   </pic:nvPicPr>
                   <pic:blipFill>
-                    <a:blip r:embed="rId16" cstate="none"/>
+                    <a:blip r:embed="rId23" cstate="none"/>
+                    <a:srcRect/>
+                    <a:stretch>
+                      <a:fillRect/>
+                    </a:stretch>
+                  </pic:blipFill>
+                  <pic:spPr bwMode="auto">
+                    <a:xfrm>
+                      <a:off x="0" y="0"/>
+                      <a:ext cx="4095750" cy="2286000"/>
+                    </a:xfrm>
+                    <a:prstGeom prst="rect">
+                      <a:avLst/>
+                    </a:prstGeom>
+                  </pic:spPr>
+                </pic:pic>
+              </a:graphicData>
+            </a:graphic>
+          </wp:inline>
+        </w:drawing>
+      </w:r>
+    </w:p>
+    <w:p>
+      <w:pPr>
+        <w:spacing w:after="110" w:line="300"/>
+        <w:jc w:val="both"/>
+      </w:pPr>
+      <w:r>
+        <w:rPr>
+          <w:rFonts w:ascii="Times New Roman" w:cs="Times New Roman" w:eastAsia="Times New Roman" w:hAnsi="Times New Roman"/>
+          <w:b/>
+          <w:bCs/>
+          <w:i w:val="false"/>
+          <w:iCs w:val="false"/>
+          <w:color w:val="2E7D32"/>
+          <w:sz w:val="24"/>
+          <w:szCs w:val="24"/>
+        </w:rPr>
+        <w:t xml:space="preserve">Définition — </w:t>
+      </w:r>
+      <w:r>
+        <w:rPr>
+          <w:rFonts w:ascii="Times New Roman" w:cs="Times New Roman" w:eastAsia="Times New Roman" w:hAnsi="Times New Roman"/>
+          <w:b/>
+          <w:bCs/>
+          <w:i w:val="false"/>
+          <w:iCs w:val="false"/>
+          <w:color w:val="000000"/>
+          <w:sz w:val="24"/>
+          <w:szCs w:val="24"/>
+        </w:rPr>
+        <w:t xml:space="preserve">L’aire du parallélogramme de base b et de hauteur h est A = b × h. L’aire du triangle est la moitié de celle du parallélogramme de mêmes base et hauteur : A = (b × h) ÷ 2. La hauteur est toujours perpendiculaire à la base.</w:t>
+      </w:r>
+    </w:p>
+    <w:p>
+      <w:pPr>
+        <w:spacing w:after="110" w:line="300"/>
+        <w:jc w:val="both"/>
+      </w:pPr>
+      <w:r>
+        <w:rPr>
+          <w:rFonts w:ascii="Times New Roman" w:cs="Times New Roman" w:eastAsia="Times New Roman" w:hAnsi="Times New Roman"/>
+          <w:b/>
+          <w:bCs/>
+          <w:i w:val="false"/>
+          <w:iCs w:val="false"/>
+          <w:color w:val="1F4E79"/>
+          <w:sz w:val="24"/>
+          <w:szCs w:val="24"/>
+        </w:rPr>
+        <w:t xml:space="preserve">Autrement dit : </w:t>
+      </w:r>
+      <w:r>
+        <w:rPr>
+          <w:rFonts w:ascii="Times New Roman" w:cs="Times New Roman" w:eastAsia="Times New Roman" w:hAnsi="Times New Roman"/>
+          <w:b w:val="false"/>
+          <w:bCs w:val="false"/>
+          <w:i w:val="false"/>
+          <w:iCs w:val="false"/>
+          <w:color w:val="000000"/>
+          <w:sz w:val="24"/>
+          <w:szCs w:val="24"/>
+        </w:rPr>
+        <w:t xml:space="preserve">parallélogramme : comme un rectangle penché, base fois hauteur ; triangle : la moitié.</w:t>
+      </w:r>
+    </w:p>
+    <w:p>
+      <w:pPr>
+        <w:spacing w:after="110" w:line="300"/>
+        <w:jc w:val="both"/>
+      </w:pPr>
+      <w:r>
+        <w:rPr>
+          <w:rFonts w:ascii="Times New Roman" w:cs="Times New Roman" w:eastAsia="Times New Roman" w:hAnsi="Times New Roman"/>
+          <w:b w:val="false"/>
+          <w:bCs w:val="false"/>
+          <w:i w:val="false"/>
+          <w:iCs w:val="false"/>
+          <w:color w:val="000000"/>
+          <w:sz w:val="24"/>
+          <w:szCs w:val="24"/>
+        </w:rPr>
+        <w:t xml:space="preserve">Le découpage-recollage montre que le parallélogramme a la même aire que le rectangle de côtés b et h : d’où A = b × h. La diagonale d’un parallélogramme le partage en deux triangles superposables, donc chaque triangle vaut (b × h) ÷ 2. Attention : h est la hauteur perpendiculaire, pas le côté penché !</w:t>
+      </w:r>
+    </w:p>
+    <w:p>
+      <w:pPr>
+        <w:spacing w:after="120" w:before="120"/>
+        <w:jc w:val="center"/>
+      </w:pPr>
+      <w:r>
+        <w:drawing>
+          <wp:inline distT="0" distB="0" distL="0" distR="0">
+            <wp:extent cx="4762500" cy="2162175"/>
+            <wp:effectExtent t="0" r="0" b="0" l="0"/>
+            <wp:docPr id="16" name="" descr="" title=""/>
+            <wp:cNvGraphicFramePr>
+              <a:graphicFrameLocks xmlns:a="http://schemas.openxmlformats.org/drawingml/2006/main" noChangeAspect="1"/>
+            </wp:cNvGraphicFramePr>
+            <a:graphic xmlns:a="http://schemas.openxmlformats.org/drawingml/2006/main">
+              <a:graphicData uri="http://schemas.openxmlformats.org/drawingml/2006/picture">
+                <pic:pic xmlns:pic="http://schemas.openxmlformats.org/drawingml/2006/picture">
+                  <pic:nvPicPr>
+                    <pic:cNvPr id="0" name="" descr=""/>
+                    <pic:cNvPicPr>
+                      <a:picLocks noChangeAspect="1" noChangeArrowheads="1"/>
+                    </pic:cNvPicPr>
+                  </pic:nvPicPr>
+                  <pic:blipFill>
+                    <a:blip r:embed="rId24" cstate="none"/>
                     <a:srcRect/>
                     <a:stretch>
                       <a:fillRect/>
@@ -25498,98 +25866,15 @@
     </w:p>
     <w:p>
       <w:pPr>
-        <w:spacing w:after="110" w:line="300"/>
-        <w:jc w:val="both"/>
-      </w:pPr>
-      <w:r>
-        <w:rPr>
-          <w:rFonts w:ascii="Times New Roman" w:cs="Times New Roman" w:eastAsia="Times New Roman" w:hAnsi="Times New Roman"/>
-          <w:b/>
-          <w:bCs/>
-          <w:i w:val="false"/>
-          <w:iCs w:val="false"/>
-          <w:color w:val="2E7D32"/>
-          <w:sz w:val="24"/>
-          <w:szCs w:val="24"/>
-        </w:rPr>
-        <w:t xml:space="preserve">Définition — </w:t>
-      </w:r>
-      <w:r>
-        <w:rPr>
-          <w:rFonts w:ascii="Times New Roman" w:cs="Times New Roman" w:eastAsia="Times New Roman" w:hAnsi="Times New Roman"/>
-          <w:b/>
-          <w:bCs/>
-          <w:i w:val="false"/>
-          <w:iCs w:val="false"/>
-          <w:color w:val="000000"/>
-          <w:sz w:val="24"/>
-          <w:szCs w:val="24"/>
-        </w:rPr>
-        <w:t xml:space="preserve">Le périmètre d’un assemblage de figures est la longueur de son contour extérieur : on additionne uniquement les côtés qui bordent l’extérieur, jamais les traits de découpage intérieurs.</w:t>
-      </w:r>
-    </w:p>
-    <w:p>
-      <w:pPr>
-        <w:spacing w:after="110" w:line="300"/>
-        <w:jc w:val="both"/>
-      </w:pPr>
-      <w:r>
-        <w:rPr>
-          <w:rFonts w:ascii="Times New Roman" w:cs="Times New Roman" w:eastAsia="Times New Roman" w:hAnsi="Times New Roman"/>
-          <w:b/>
-          <w:bCs/>
-          <w:i w:val="false"/>
-          <w:iCs w:val="false"/>
-          <w:color w:val="1F4E79"/>
-          <w:sz w:val="24"/>
-          <w:szCs w:val="24"/>
-        </w:rPr>
-        <w:t xml:space="preserve">Autrement dit : </w:t>
-      </w:r>
-      <w:r>
-        <w:rPr>
-          <w:rFonts w:ascii="Times New Roman" w:cs="Times New Roman" w:eastAsia="Times New Roman" w:hAnsi="Times New Roman"/>
-          <w:b w:val="false"/>
-          <w:bCs w:val="false"/>
-          <w:i w:val="false"/>
-          <w:iCs w:val="false"/>
-          <w:color w:val="000000"/>
-          <w:sz w:val="24"/>
-          <w:szCs w:val="24"/>
-        </w:rPr>
-        <w:t xml:space="preserve">on fait le tour de la figure avec le doigt et on additionne tout ce qu’on longe — rien d’autre.</w:t>
-      </w:r>
-    </w:p>
-    <w:p>
-      <w:pPr>
-        <w:spacing w:after="110" w:line="300"/>
-        <w:jc w:val="both"/>
-      </w:pPr>
-      <w:r>
-        <w:rPr>
-          <w:rFonts w:ascii="Times New Roman" w:cs="Times New Roman" w:eastAsia="Times New Roman" w:hAnsi="Times New Roman"/>
-          <w:b w:val="false"/>
-          <w:bCs w:val="false"/>
-          <w:i w:val="false"/>
-          <w:iCs w:val="false"/>
-          <w:color w:val="000000"/>
-          <w:sz w:val="24"/>
-          <w:szCs w:val="24"/>
-        </w:rPr>
-        <w:t xml:space="preserve">Dans une figure en L, certains côtés manquent souvent sur le plan : on les retrouve par addition ou soustraction des côtés parallèles. Par exemple, si la largeur totale est 6 m et qu’un morceau mesure 2 m, le côté manquant mesure 6 − 2 = 4 m. Une fois tous les côtés connus, le périmètre est leur somme : les traits intérieurs de découpage ne comptent pas.</w:t>
-      </w:r>
-    </w:p>
-    <w:p>
-      <w:pPr>
         <w:spacing w:after="120" w:before="120"/>
         <w:jc w:val="center"/>
       </w:pPr>
       <w:r>
         <w:drawing>
           <wp:inline distT="0" distB="0" distL="0" distR="0">
-            <wp:extent cx="4762500" cy="2209800"/>
+            <wp:extent cx="4095750" cy="2286000"/>
             <wp:effectExtent t="0" r="0" b="0" l="0"/>
-            <wp:docPr id="9" name="" descr="" title=""/>
+            <wp:docPr id="17" name="" descr="" title=""/>
             <wp:cNvGraphicFramePr>
               <a:graphicFrameLocks xmlns:a="http://schemas.openxmlformats.org/drawingml/2006/main" noChangeAspect="1"/>
             </wp:cNvGraphicFramePr>
@@ -25603,7 +25888,136 @@
                     </pic:cNvPicPr>
                   </pic:nvPicPr>
                   <pic:blipFill>
-                    <a:blip r:embed="rId17" cstate="none"/>
+                    <a:blip r:embed="rId25" cstate="none"/>
+                    <a:srcRect/>
+                    <a:stretch>
+                      <a:fillRect/>
+                    </a:stretch>
+                  </pic:blipFill>
+                  <pic:spPr bwMode="auto">
+                    <a:xfrm>
+                      <a:off x="0" y="0"/>
+                      <a:ext cx="4095750" cy="2286000"/>
+                    </a:xfrm>
+                    <a:prstGeom prst="rect">
+                      <a:avLst/>
+                    </a:prstGeom>
+                  </pic:spPr>
+                </pic:pic>
+              </a:graphicData>
+            </a:graphic>
+          </wp:inline>
+        </w:drawing>
+      </w:r>
+    </w:p>
+    <w:p>
+      <w:pPr>
+        <w:spacing w:after="110" w:line="300"/>
+        <w:jc w:val="both"/>
+      </w:pPr>
+      <w:r>
+        <w:rPr>
+          <w:rFonts w:ascii="Times New Roman" w:cs="Times New Roman" w:eastAsia="Times New Roman" w:hAnsi="Times New Roman"/>
+          <w:b/>
+          <w:bCs/>
+          <w:i w:val="false"/>
+          <w:iCs w:val="false"/>
+          <w:color w:val="2E7D32"/>
+          <w:sz w:val="24"/>
+          <w:szCs w:val="24"/>
+        </w:rPr>
+        <w:t xml:space="preserve">Définition — </w:t>
+      </w:r>
+      <w:r>
+        <w:rPr>
+          <w:rFonts w:ascii="Times New Roman" w:cs="Times New Roman" w:eastAsia="Times New Roman" w:hAnsi="Times New Roman"/>
+          <w:b/>
+          <w:bCs/>
+          <w:i w:val="false"/>
+          <w:iCs w:val="false"/>
+          <w:color w:val="000000"/>
+          <w:sz w:val="24"/>
+          <w:szCs w:val="24"/>
+        </w:rPr>
+        <w:t xml:space="preserve">Le périmètre d’un assemblage de figures est la longueur de son contour extérieur : on additionne uniquement les côtés qui bordent l’extérieur, jamais les traits de découpage intérieurs.</w:t>
+      </w:r>
+    </w:p>
+    <w:p>
+      <w:pPr>
+        <w:spacing w:after="110" w:line="300"/>
+        <w:jc w:val="both"/>
+      </w:pPr>
+      <w:r>
+        <w:rPr>
+          <w:rFonts w:ascii="Times New Roman" w:cs="Times New Roman" w:eastAsia="Times New Roman" w:hAnsi="Times New Roman"/>
+          <w:b/>
+          <w:bCs/>
+          <w:i w:val="false"/>
+          <w:iCs w:val="false"/>
+          <w:color w:val="1F4E79"/>
+          <w:sz w:val="24"/>
+          <w:szCs w:val="24"/>
+        </w:rPr>
+        <w:t xml:space="preserve">Autrement dit : </w:t>
+      </w:r>
+      <w:r>
+        <w:rPr>
+          <w:rFonts w:ascii="Times New Roman" w:cs="Times New Roman" w:eastAsia="Times New Roman" w:hAnsi="Times New Roman"/>
+          <w:b w:val="false"/>
+          <w:bCs w:val="false"/>
+          <w:i w:val="false"/>
+          <w:iCs w:val="false"/>
+          <w:color w:val="000000"/>
+          <w:sz w:val="24"/>
+          <w:szCs w:val="24"/>
+        </w:rPr>
+        <w:t xml:space="preserve">on fait le tour de la figure avec le doigt et on additionne tout ce qu’on longe — rien d’autre.</w:t>
+      </w:r>
+    </w:p>
+    <w:p>
+      <w:pPr>
+        <w:spacing w:after="110" w:line="300"/>
+        <w:jc w:val="both"/>
+      </w:pPr>
+      <w:r>
+        <w:rPr>
+          <w:rFonts w:ascii="Times New Roman" w:cs="Times New Roman" w:eastAsia="Times New Roman" w:hAnsi="Times New Roman"/>
+          <w:b w:val="false"/>
+          <w:bCs w:val="false"/>
+          <w:i w:val="false"/>
+          <w:iCs w:val="false"/>
+          <w:color w:val="000000"/>
+          <w:sz w:val="24"/>
+          <w:szCs w:val="24"/>
+        </w:rPr>
+        <w:t xml:space="preserve">Dans une figure en L, certains côtés manquent souvent sur le plan : on les retrouve par addition ou soustraction des côtés parallèles. Par exemple, si la largeur totale est 6 m et qu’un morceau mesure 2 m, le côté manquant mesure 6 − 2 = 4 m. Une fois tous les côtés connus, le périmètre est leur somme : les traits intérieurs de découpage ne comptent pas.</w:t>
+      </w:r>
+    </w:p>
+    <w:p>
+      <w:pPr>
+        <w:spacing w:after="120" w:before="120"/>
+        <w:jc w:val="center"/>
+      </w:pPr>
+      <w:r>
+        <w:drawing>
+          <wp:inline distT="0" distB="0" distL="0" distR="0">
+            <wp:extent cx="4762500" cy="2209800"/>
+            <wp:effectExtent t="0" r="0" b="0" l="0"/>
+            <wp:docPr id="18" name="" descr="" title=""/>
+            <wp:cNvGraphicFramePr>
+              <a:graphicFrameLocks xmlns:a="http://schemas.openxmlformats.org/drawingml/2006/main" noChangeAspect="1"/>
+            </wp:cNvGraphicFramePr>
+            <a:graphic xmlns:a="http://schemas.openxmlformats.org/drawingml/2006/main">
+              <a:graphicData uri="http://schemas.openxmlformats.org/drawingml/2006/picture">
+                <pic:pic xmlns:pic="http://schemas.openxmlformats.org/drawingml/2006/picture">
+                  <pic:nvPicPr>
+                    <pic:cNvPr id="0" name="" descr=""/>
+                    <pic:cNvPicPr>
+                      <a:picLocks noChangeAspect="1" noChangeArrowheads="1"/>
+                    </pic:cNvPicPr>
+                  </pic:nvPicPr>
+                  <pic:blipFill>
+                    <a:blip r:embed="rId26" cstate="none"/>
                     <a:srcRect/>
                     <a:stretch>
                       <a:fillRect/>
@@ -28347,98 +28761,15 @@
     </w:p>
     <w:p>
       <w:pPr>
-        <w:spacing w:after="110" w:line="300"/>
-        <w:jc w:val="both"/>
-      </w:pPr>
-      <w:r>
-        <w:rPr>
-          <w:rFonts w:ascii="Times New Roman" w:cs="Times New Roman" w:eastAsia="Times New Roman" w:hAnsi="Times New Roman"/>
-          <w:b/>
-          <w:bCs/>
-          <w:i w:val="false"/>
-          <w:iCs w:val="false"/>
-          <w:color w:val="2E7D32"/>
-          <w:sz w:val="24"/>
-          <w:szCs w:val="24"/>
-        </w:rPr>
-        <w:t xml:space="preserve">Définition — </w:t>
-      </w:r>
-      <w:r>
-        <w:rPr>
-          <w:rFonts w:ascii="Times New Roman" w:cs="Times New Roman" w:eastAsia="Times New Roman" w:hAnsi="Times New Roman"/>
-          <w:b/>
-          <w:bCs/>
-          <w:i w:val="false"/>
-          <w:iCs w:val="false"/>
-          <w:color w:val="000000"/>
-          <w:sz w:val="24"/>
-          <w:szCs w:val="24"/>
-        </w:rPr>
-        <w:t xml:space="preserve">Pour calculer l’aire d’un assemblage, on le découpe en figures simples (rectangles, carrés, triangles) et on additionne leurs aires ; ou bien on complète la figure en une figure simple et on soustrait la partie ajoutée.</w:t>
-      </w:r>
-    </w:p>
-    <w:p>
-      <w:pPr>
-        <w:spacing w:after="110" w:line="300"/>
-        <w:jc w:val="both"/>
-      </w:pPr>
-      <w:r>
-        <w:rPr>
-          <w:rFonts w:ascii="Times New Roman" w:cs="Times New Roman" w:eastAsia="Times New Roman" w:hAnsi="Times New Roman"/>
-          <w:b/>
-          <w:bCs/>
-          <w:i w:val="false"/>
-          <w:iCs w:val="false"/>
-          <w:color w:val="1F4E79"/>
-          <w:sz w:val="24"/>
-          <w:szCs w:val="24"/>
-        </w:rPr>
-        <w:t xml:space="preserve">Autrement dit : </w:t>
-      </w:r>
-      <w:r>
-        <w:rPr>
-          <w:rFonts w:ascii="Times New Roman" w:cs="Times New Roman" w:eastAsia="Times New Roman" w:hAnsi="Times New Roman"/>
-          <w:b w:val="false"/>
-          <w:bCs w:val="false"/>
-          <w:i w:val="false"/>
-          <w:iCs w:val="false"/>
-          <w:color w:val="000000"/>
-          <w:sz w:val="24"/>
-          <w:szCs w:val="24"/>
-        </w:rPr>
-        <w:t xml:space="preserve">découper et additionner, ou compléter et soustraire : deux chemins pour la même aire.</w:t>
-      </w:r>
-    </w:p>
-    <w:p>
-      <w:pPr>
-        <w:spacing w:after="110" w:line="300"/>
-        <w:jc w:val="both"/>
-      </w:pPr>
-      <w:r>
-        <w:rPr>
-          <w:rFonts w:ascii="Times New Roman" w:cs="Times New Roman" w:eastAsia="Times New Roman" w:hAnsi="Times New Roman"/>
-          <w:b w:val="false"/>
-          <w:bCs w:val="false"/>
-          <w:i w:val="false"/>
-          <w:iCs w:val="false"/>
-          <w:color w:val="000000"/>
-          <w:sz w:val="24"/>
-          <w:szCs w:val="24"/>
-        </w:rPr>
-        <w:t xml:space="preserve">Le L se découpe en un rectangle 6 × 2 et un rectangle 2 × 3 : A = 12 + 6 = 18 m². On peut aussi voir le L comme un grand rectangle 6 × 5 auquel on a enlevé un coin 4 × 3 : A = 30 − 12 = 18 m². Les deux méthodes donnent toujours le même résultat : l’aire ne dépend pas du découpage choisi.</w:t>
-      </w:r>
-    </w:p>
-    <w:p>
-      <w:pPr>
         <w:spacing w:after="120" w:before="120"/>
         <w:jc w:val="center"/>
       </w:pPr>
       <w:r>
         <w:drawing>
           <wp:inline distT="0" distB="0" distL="0" distR="0">
-            <wp:extent cx="4762500" cy="2209800"/>
+            <wp:extent cx="4095750" cy="2286000"/>
             <wp:effectExtent t="0" r="0" b="0" l="0"/>
-            <wp:docPr id="10" name="" descr="" title=""/>
+            <wp:docPr id="19" name="" descr="" title=""/>
             <wp:cNvGraphicFramePr>
               <a:graphicFrameLocks xmlns:a="http://schemas.openxmlformats.org/drawingml/2006/main" noChangeAspect="1"/>
             </wp:cNvGraphicFramePr>
@@ -28452,7 +28783,136 @@
                     </pic:cNvPicPr>
                   </pic:nvPicPr>
                   <pic:blipFill>
-                    <a:blip r:embed="rId18" cstate="none"/>
+                    <a:blip r:embed="rId27" cstate="none"/>
+                    <a:srcRect/>
+                    <a:stretch>
+                      <a:fillRect/>
+                    </a:stretch>
+                  </pic:blipFill>
+                  <pic:spPr bwMode="auto">
+                    <a:xfrm>
+                      <a:off x="0" y="0"/>
+                      <a:ext cx="4095750" cy="2286000"/>
+                    </a:xfrm>
+                    <a:prstGeom prst="rect">
+                      <a:avLst/>
+                    </a:prstGeom>
+                  </pic:spPr>
+                </pic:pic>
+              </a:graphicData>
+            </a:graphic>
+          </wp:inline>
+        </w:drawing>
+      </w:r>
+    </w:p>
+    <w:p>
+      <w:pPr>
+        <w:spacing w:after="110" w:line="300"/>
+        <w:jc w:val="both"/>
+      </w:pPr>
+      <w:r>
+        <w:rPr>
+          <w:rFonts w:ascii="Times New Roman" w:cs="Times New Roman" w:eastAsia="Times New Roman" w:hAnsi="Times New Roman"/>
+          <w:b/>
+          <w:bCs/>
+          <w:i w:val="false"/>
+          <w:iCs w:val="false"/>
+          <w:color w:val="2E7D32"/>
+          <w:sz w:val="24"/>
+          <w:szCs w:val="24"/>
+        </w:rPr>
+        <w:t xml:space="preserve">Définition — </w:t>
+      </w:r>
+      <w:r>
+        <w:rPr>
+          <w:rFonts w:ascii="Times New Roman" w:cs="Times New Roman" w:eastAsia="Times New Roman" w:hAnsi="Times New Roman"/>
+          <w:b/>
+          <w:bCs/>
+          <w:i w:val="false"/>
+          <w:iCs w:val="false"/>
+          <w:color w:val="000000"/>
+          <w:sz w:val="24"/>
+          <w:szCs w:val="24"/>
+        </w:rPr>
+        <w:t xml:space="preserve">Pour calculer l’aire d’un assemblage, on le découpe en figures simples (rectangles, carrés, triangles) et on additionne leurs aires ; ou bien on complète la figure en une figure simple et on soustrait la partie ajoutée.</w:t>
+      </w:r>
+    </w:p>
+    <w:p>
+      <w:pPr>
+        <w:spacing w:after="110" w:line="300"/>
+        <w:jc w:val="both"/>
+      </w:pPr>
+      <w:r>
+        <w:rPr>
+          <w:rFonts w:ascii="Times New Roman" w:cs="Times New Roman" w:eastAsia="Times New Roman" w:hAnsi="Times New Roman"/>
+          <w:b/>
+          <w:bCs/>
+          <w:i w:val="false"/>
+          <w:iCs w:val="false"/>
+          <w:color w:val="1F4E79"/>
+          <w:sz w:val="24"/>
+          <w:szCs w:val="24"/>
+        </w:rPr>
+        <w:t xml:space="preserve">Autrement dit : </w:t>
+      </w:r>
+      <w:r>
+        <w:rPr>
+          <w:rFonts w:ascii="Times New Roman" w:cs="Times New Roman" w:eastAsia="Times New Roman" w:hAnsi="Times New Roman"/>
+          <w:b w:val="false"/>
+          <w:bCs w:val="false"/>
+          <w:i w:val="false"/>
+          <w:iCs w:val="false"/>
+          <w:color w:val="000000"/>
+          <w:sz w:val="24"/>
+          <w:szCs w:val="24"/>
+        </w:rPr>
+        <w:t xml:space="preserve">découper et additionner, ou compléter et soustraire : deux chemins pour la même aire.</w:t>
+      </w:r>
+    </w:p>
+    <w:p>
+      <w:pPr>
+        <w:spacing w:after="110" w:line="300"/>
+        <w:jc w:val="both"/>
+      </w:pPr>
+      <w:r>
+        <w:rPr>
+          <w:rFonts w:ascii="Times New Roman" w:cs="Times New Roman" w:eastAsia="Times New Roman" w:hAnsi="Times New Roman"/>
+          <w:b w:val="false"/>
+          <w:bCs w:val="false"/>
+          <w:i w:val="false"/>
+          <w:iCs w:val="false"/>
+          <w:color w:val="000000"/>
+          <w:sz w:val="24"/>
+          <w:szCs w:val="24"/>
+        </w:rPr>
+        <w:t xml:space="preserve">Le L se découpe en un rectangle 6 × 2 et un rectangle 2 × 3 : A = 12 + 6 = 18 m². On peut aussi voir le L comme un grand rectangle 6 × 5 auquel on a enlevé un coin 4 × 3 : A = 30 − 12 = 18 m². Les deux méthodes donnent toujours le même résultat : l’aire ne dépend pas du découpage choisi.</w:t>
+      </w:r>
+    </w:p>
+    <w:p>
+      <w:pPr>
+        <w:spacing w:after="120" w:before="120"/>
+        <w:jc w:val="center"/>
+      </w:pPr>
+      <w:r>
+        <w:drawing>
+          <wp:inline distT="0" distB="0" distL="0" distR="0">
+            <wp:extent cx="4762500" cy="2209800"/>
+            <wp:effectExtent t="0" r="0" b="0" l="0"/>
+            <wp:docPr id="20" name="" descr="" title=""/>
+            <wp:cNvGraphicFramePr>
+              <a:graphicFrameLocks xmlns:a="http://schemas.openxmlformats.org/drawingml/2006/main" noChangeAspect="1"/>
+            </wp:cNvGraphicFramePr>
+            <a:graphic xmlns:a="http://schemas.openxmlformats.org/drawingml/2006/main">
+              <a:graphicData uri="http://schemas.openxmlformats.org/drawingml/2006/picture">
+                <pic:pic xmlns:pic="http://schemas.openxmlformats.org/drawingml/2006/picture">
+                  <pic:nvPicPr>
+                    <pic:cNvPr id="0" name="" descr=""/>
+                    <pic:cNvPicPr>
+                      <a:picLocks noChangeAspect="1" noChangeArrowheads="1"/>
+                    </pic:cNvPicPr>
+                  </pic:nvPicPr>
+                  <pic:blipFill>
+                    <a:blip r:embed="rId28" cstate="none"/>
                     <a:srcRect/>
                     <a:stretch>
                       <a:fillRect/>
@@ -31196,98 +31656,15 @@
     </w:p>
     <w:p>
       <w:pPr>
-        <w:spacing w:after="110" w:line="300"/>
-        <w:jc w:val="both"/>
-      </w:pPr>
-      <w:r>
-        <w:rPr>
-          <w:rFonts w:ascii="Times New Roman" w:cs="Times New Roman" w:eastAsia="Times New Roman" w:hAnsi="Times New Roman"/>
-          <w:b/>
-          <w:bCs/>
-          <w:i w:val="false"/>
-          <w:iCs w:val="false"/>
-          <w:color w:val="2E7D32"/>
-          <w:sz w:val="24"/>
-          <w:szCs w:val="24"/>
-        </w:rPr>
-        <w:t xml:space="preserve">Définition — </w:t>
-      </w:r>
-      <w:r>
-        <w:rPr>
-          <w:rFonts w:ascii="Times New Roman" w:cs="Times New Roman" w:eastAsia="Times New Roman" w:hAnsi="Times New Roman"/>
-          <w:b/>
-          <w:bCs/>
-          <w:i w:val="false"/>
-          <w:iCs w:val="false"/>
-          <w:color w:val="000000"/>
-          <w:sz w:val="24"/>
-          <w:szCs w:val="24"/>
-        </w:rPr>
-        <w:t xml:space="preserve">Dans un problème, le périmètre répond aux questions de contour (clôturer, entourer, encadrer) et l’aire aux questions de surface (couvrir, peindre, semer, carreler). Choisir la bonne grandeur est la première étape de la résolution.</w:t>
-      </w:r>
-    </w:p>
-    <w:p>
-      <w:pPr>
-        <w:spacing w:after="110" w:line="300"/>
-        <w:jc w:val="both"/>
-      </w:pPr>
-      <w:r>
-        <w:rPr>
-          <w:rFonts w:ascii="Times New Roman" w:cs="Times New Roman" w:eastAsia="Times New Roman" w:hAnsi="Times New Roman"/>
-          <w:b/>
-          <w:bCs/>
-          <w:i w:val="false"/>
-          <w:iCs w:val="false"/>
-          <w:color w:val="1F4E79"/>
-          <w:sz w:val="24"/>
-          <w:szCs w:val="24"/>
-        </w:rPr>
-        <w:t xml:space="preserve">Autrement dit : </w:t>
-      </w:r>
-      <w:r>
-        <w:rPr>
-          <w:rFonts w:ascii="Times New Roman" w:cs="Times New Roman" w:eastAsia="Times New Roman" w:hAnsi="Times New Roman"/>
-          <w:b w:val="false"/>
-          <w:bCs w:val="false"/>
-          <w:i w:val="false"/>
-          <w:iCs w:val="false"/>
-          <w:color w:val="000000"/>
-          <w:sz w:val="24"/>
-          <w:szCs w:val="24"/>
-        </w:rPr>
-        <w:t xml:space="preserve">clôture → périmètre ; peinture ou gazon → aire. Le verbe de l’énoncé dit quelle grandeur choisir.</w:t>
-      </w:r>
-    </w:p>
-    <w:p>
-      <w:pPr>
-        <w:spacing w:after="110" w:line="300"/>
-        <w:jc w:val="both"/>
-      </w:pPr>
-      <w:r>
-        <w:rPr>
-          <w:rFonts w:ascii="Times New Roman" w:cs="Times New Roman" w:eastAsia="Times New Roman" w:hAnsi="Times New Roman"/>
-          <w:b w:val="false"/>
-          <w:bCs w:val="false"/>
-          <w:i w:val="false"/>
-          <w:iCs w:val="false"/>
-          <w:color w:val="000000"/>
-          <w:sz w:val="24"/>
-          <w:szCs w:val="24"/>
-        </w:rPr>
-        <w:t xml:space="preserve">Un même terrain a un périmètre ET une aire, qui ne varient pas ensemble : deux terrains de même périmètre peuvent avoir des aires très différentes. Pour le terrain de Hery : l’aire se calcule par découpage (60 + 16 = 76 m²), le contour en suivant le bord extérieur. On répond toujours par deux phrases séparées, chacune avec sa propre unité : m pour le contour, m² pour la surface.</w:t>
-      </w:r>
-    </w:p>
-    <w:p>
-      <w:pPr>
         <w:spacing w:after="120" w:before="120"/>
         <w:jc w:val="center"/>
       </w:pPr>
       <w:r>
         <w:drawing>
           <wp:inline distT="0" distB="0" distL="0" distR="0">
-            <wp:extent cx="4762500" cy="2209800"/>
+            <wp:extent cx="4095750" cy="2286000"/>
             <wp:effectExtent t="0" r="0" b="0" l="0"/>
-            <wp:docPr id="11" name="" descr="" title=""/>
+            <wp:docPr id="21" name="" descr="" title=""/>
             <wp:cNvGraphicFramePr>
               <a:graphicFrameLocks xmlns:a="http://schemas.openxmlformats.org/drawingml/2006/main" noChangeAspect="1"/>
             </wp:cNvGraphicFramePr>
@@ -31301,7 +31678,136 @@
                     </pic:cNvPicPr>
                   </pic:nvPicPr>
                   <pic:blipFill>
-                    <a:blip r:embed="rId19" cstate="none"/>
+                    <a:blip r:embed="rId29" cstate="none"/>
+                    <a:srcRect/>
+                    <a:stretch>
+                      <a:fillRect/>
+                    </a:stretch>
+                  </pic:blipFill>
+                  <pic:spPr bwMode="auto">
+                    <a:xfrm>
+                      <a:off x="0" y="0"/>
+                      <a:ext cx="4095750" cy="2286000"/>
+                    </a:xfrm>
+                    <a:prstGeom prst="rect">
+                      <a:avLst/>
+                    </a:prstGeom>
+                  </pic:spPr>
+                </pic:pic>
+              </a:graphicData>
+            </a:graphic>
+          </wp:inline>
+        </w:drawing>
+      </w:r>
+    </w:p>
+    <w:p>
+      <w:pPr>
+        <w:spacing w:after="110" w:line="300"/>
+        <w:jc w:val="both"/>
+      </w:pPr>
+      <w:r>
+        <w:rPr>
+          <w:rFonts w:ascii="Times New Roman" w:cs="Times New Roman" w:eastAsia="Times New Roman" w:hAnsi="Times New Roman"/>
+          <w:b/>
+          <w:bCs/>
+          <w:i w:val="false"/>
+          <w:iCs w:val="false"/>
+          <w:color w:val="2E7D32"/>
+          <w:sz w:val="24"/>
+          <w:szCs w:val="24"/>
+        </w:rPr>
+        <w:t xml:space="preserve">Définition — </w:t>
+      </w:r>
+      <w:r>
+        <w:rPr>
+          <w:rFonts w:ascii="Times New Roman" w:cs="Times New Roman" w:eastAsia="Times New Roman" w:hAnsi="Times New Roman"/>
+          <w:b/>
+          <w:bCs/>
+          <w:i w:val="false"/>
+          <w:iCs w:val="false"/>
+          <w:color w:val="000000"/>
+          <w:sz w:val="24"/>
+          <w:szCs w:val="24"/>
+        </w:rPr>
+        <w:t xml:space="preserve">Dans un problème, le périmètre répond aux questions de contour (clôturer, entourer, encadrer) et l’aire aux questions de surface (couvrir, peindre, semer, carreler). Choisir la bonne grandeur est la première étape de la résolution.</w:t>
+      </w:r>
+    </w:p>
+    <w:p>
+      <w:pPr>
+        <w:spacing w:after="110" w:line="300"/>
+        <w:jc w:val="both"/>
+      </w:pPr>
+      <w:r>
+        <w:rPr>
+          <w:rFonts w:ascii="Times New Roman" w:cs="Times New Roman" w:eastAsia="Times New Roman" w:hAnsi="Times New Roman"/>
+          <w:b/>
+          <w:bCs/>
+          <w:i w:val="false"/>
+          <w:iCs w:val="false"/>
+          <w:color w:val="1F4E79"/>
+          <w:sz w:val="24"/>
+          <w:szCs w:val="24"/>
+        </w:rPr>
+        <w:t xml:space="preserve">Autrement dit : </w:t>
+      </w:r>
+      <w:r>
+        <w:rPr>
+          <w:rFonts w:ascii="Times New Roman" w:cs="Times New Roman" w:eastAsia="Times New Roman" w:hAnsi="Times New Roman"/>
+          <w:b w:val="false"/>
+          <w:bCs w:val="false"/>
+          <w:i w:val="false"/>
+          <w:iCs w:val="false"/>
+          <w:color w:val="000000"/>
+          <w:sz w:val="24"/>
+          <w:szCs w:val="24"/>
+        </w:rPr>
+        <w:t xml:space="preserve">clôture → périmètre ; peinture ou gazon → aire. Le verbe de l’énoncé dit quelle grandeur choisir.</w:t>
+      </w:r>
+    </w:p>
+    <w:p>
+      <w:pPr>
+        <w:spacing w:after="110" w:line="300"/>
+        <w:jc w:val="both"/>
+      </w:pPr>
+      <w:r>
+        <w:rPr>
+          <w:rFonts w:ascii="Times New Roman" w:cs="Times New Roman" w:eastAsia="Times New Roman" w:hAnsi="Times New Roman"/>
+          <w:b w:val="false"/>
+          <w:bCs w:val="false"/>
+          <w:i w:val="false"/>
+          <w:iCs w:val="false"/>
+          <w:color w:val="000000"/>
+          <w:sz w:val="24"/>
+          <w:szCs w:val="24"/>
+        </w:rPr>
+        <w:t xml:space="preserve">Un même terrain a un périmètre ET une aire, qui ne varient pas ensemble : deux terrains de même périmètre peuvent avoir des aires très différentes. Pour le terrain de Hery : l’aire se calcule par découpage (60 + 16 = 76 m²), le contour en suivant le bord extérieur. On répond toujours par deux phrases séparées, chacune avec sa propre unité : m pour le contour, m² pour la surface.</w:t>
+      </w:r>
+    </w:p>
+    <w:p>
+      <w:pPr>
+        <w:spacing w:after="120" w:before="120"/>
+        <w:jc w:val="center"/>
+      </w:pPr>
+      <w:r>
+        <w:drawing>
+          <wp:inline distT="0" distB="0" distL="0" distR="0">
+            <wp:extent cx="4762500" cy="2209800"/>
+            <wp:effectExtent t="0" r="0" b="0" l="0"/>
+            <wp:docPr id="22" name="" descr="" title=""/>
+            <wp:cNvGraphicFramePr>
+              <a:graphicFrameLocks xmlns:a="http://schemas.openxmlformats.org/drawingml/2006/main" noChangeAspect="1"/>
+            </wp:cNvGraphicFramePr>
+            <a:graphic xmlns:a="http://schemas.openxmlformats.org/drawingml/2006/main">
+              <a:graphicData uri="http://schemas.openxmlformats.org/drawingml/2006/picture">
+                <pic:pic xmlns:pic="http://schemas.openxmlformats.org/drawingml/2006/picture">
+                  <pic:nvPicPr>
+                    <pic:cNvPr id="0" name="" descr=""/>
+                    <pic:cNvPicPr>
+                      <a:picLocks noChangeAspect="1" noChangeArrowheads="1"/>
+                    </pic:cNvPicPr>
+                  </pic:nvPicPr>
+                  <pic:blipFill>
+                    <a:blip r:embed="rId30" cstate="none"/>
                     <a:srcRect/>
                     <a:stretch>
                       <a:fillRect/>
@@ -34045,98 +34551,15 @@
     </w:p>
     <w:p>
       <w:pPr>
-        <w:spacing w:after="110" w:line="300"/>
-        <w:jc w:val="both"/>
-      </w:pPr>
-      <w:r>
-        <w:rPr>
-          <w:rFonts w:ascii="Times New Roman" w:cs="Times New Roman" w:eastAsia="Times New Roman" w:hAnsi="Times New Roman"/>
-          <w:b/>
-          <w:bCs/>
-          <w:i w:val="false"/>
-          <w:iCs w:val="false"/>
-          <w:color w:val="2E7D32"/>
-          <w:sz w:val="24"/>
-          <w:szCs w:val="24"/>
-        </w:rPr>
-        <w:t xml:space="preserve">Définition — </w:t>
-      </w:r>
-      <w:r>
-        <w:rPr>
-          <w:rFonts w:ascii="Times New Roman" w:cs="Times New Roman" w:eastAsia="Times New Roman" w:hAnsi="Times New Roman"/>
-          <w:b/>
-          <w:bCs/>
-          <w:i w:val="false"/>
-          <w:iCs w:val="false"/>
-          <w:color w:val="000000"/>
-          <w:sz w:val="24"/>
-          <w:szCs w:val="24"/>
-        </w:rPr>
-        <w:t xml:space="preserve">Le volume mesure la place occupée dans l’espace, en m³, dm³, cm³. La contenance mesure ce qu’un récipient peut contenir, en L, cL, mL. Les deux systèmes sont reliés par : 1 L = 1 dm³, 1 mL = 1 cm³ et 1 000 L = 1 m³.</w:t>
-      </w:r>
-    </w:p>
-    <w:p>
-      <w:pPr>
-        <w:spacing w:after="110" w:line="300"/>
-        <w:jc w:val="both"/>
-      </w:pPr>
-      <w:r>
-        <w:rPr>
-          <w:rFonts w:ascii="Times New Roman" w:cs="Times New Roman" w:eastAsia="Times New Roman" w:hAnsi="Times New Roman"/>
-          <w:b/>
-          <w:bCs/>
-          <w:i w:val="false"/>
-          <w:iCs w:val="false"/>
-          <w:color w:val="1F4E79"/>
-          <w:sz w:val="24"/>
-          <w:szCs w:val="24"/>
-        </w:rPr>
-        <w:t xml:space="preserve">Autrement dit : </w:t>
-      </w:r>
-      <w:r>
-        <w:rPr>
-          <w:rFonts w:ascii="Times New Roman" w:cs="Times New Roman" w:eastAsia="Times New Roman" w:hAnsi="Times New Roman"/>
-          <w:b w:val="false"/>
-          <w:bCs w:val="false"/>
-          <w:i w:val="false"/>
-          <w:iCs w:val="false"/>
-          <w:color w:val="000000"/>
-          <w:sz w:val="24"/>
-          <w:szCs w:val="24"/>
-        </w:rPr>
-        <w:t xml:space="preserve">un litre, c’est exactement le contenu d’un cube de 1 dm de côté ; un millilitre, celui d’un petit cube de 1 cm.</w:t>
-      </w:r>
-    </w:p>
-    <w:p>
-      <w:pPr>
-        <w:spacing w:after="110" w:line="300"/>
-        <w:jc w:val="both"/>
-      </w:pPr>
-      <w:r>
-        <w:rPr>
-          <w:rFonts w:ascii="Times New Roman" w:cs="Times New Roman" w:eastAsia="Times New Roman" w:hAnsi="Times New Roman"/>
-          <w:b w:val="false"/>
-          <w:bCs w:val="false"/>
-          <w:i w:val="false"/>
-          <w:iCs w:val="false"/>
-          <w:color w:val="000000"/>
-          <w:sz w:val="24"/>
-          <w:szCs w:val="24"/>
-        </w:rPr>
-        <w:t xml:space="preserve">Les unités de volume vont de 1 000 en 1 000 : 1 m³ = 1 000 dm³ et 1 dm³ = 1 000 cm³, car un cube de 10 sur 10 sur 10 contient 10 × 10 × 10 = 1 000 petits cubes. Le pont entre les deux familles passe par le litre : réservoir de 2 m³ = 2 000 L ; seringue de 5 mL = 5 cm³.</w:t>
-      </w:r>
-    </w:p>
-    <w:p>
-      <w:pPr>
         <w:spacing w:after="120" w:before="120"/>
         <w:jc w:val="center"/>
       </w:pPr>
       <w:r>
         <w:drawing>
           <wp:inline distT="0" distB="0" distL="0" distR="0">
-            <wp:extent cx="4762500" cy="2362200"/>
+            <wp:extent cx="4095750" cy="2286000"/>
             <wp:effectExtent t="0" r="0" b="0" l="0"/>
-            <wp:docPr id="12" name="" descr="" title=""/>
+            <wp:docPr id="23" name="" descr="" title=""/>
             <wp:cNvGraphicFramePr>
               <a:graphicFrameLocks xmlns:a="http://schemas.openxmlformats.org/drawingml/2006/main" noChangeAspect="1"/>
             </wp:cNvGraphicFramePr>
@@ -34150,7 +34573,136 @@
                     </pic:cNvPicPr>
                   </pic:nvPicPr>
                   <pic:blipFill>
-                    <a:blip r:embed="rId20" cstate="none"/>
+                    <a:blip r:embed="rId31" cstate="none"/>
+                    <a:srcRect/>
+                    <a:stretch>
+                      <a:fillRect/>
+                    </a:stretch>
+                  </pic:blipFill>
+                  <pic:spPr bwMode="auto">
+                    <a:xfrm>
+                      <a:off x="0" y="0"/>
+                      <a:ext cx="4095750" cy="2286000"/>
+                    </a:xfrm>
+                    <a:prstGeom prst="rect">
+                      <a:avLst/>
+                    </a:prstGeom>
+                  </pic:spPr>
+                </pic:pic>
+              </a:graphicData>
+            </a:graphic>
+          </wp:inline>
+        </w:drawing>
+      </w:r>
+    </w:p>
+    <w:p>
+      <w:pPr>
+        <w:spacing w:after="110" w:line="300"/>
+        <w:jc w:val="both"/>
+      </w:pPr>
+      <w:r>
+        <w:rPr>
+          <w:rFonts w:ascii="Times New Roman" w:cs="Times New Roman" w:eastAsia="Times New Roman" w:hAnsi="Times New Roman"/>
+          <w:b/>
+          <w:bCs/>
+          <w:i w:val="false"/>
+          <w:iCs w:val="false"/>
+          <w:color w:val="2E7D32"/>
+          <w:sz w:val="24"/>
+          <w:szCs w:val="24"/>
+        </w:rPr>
+        <w:t xml:space="preserve">Définition — </w:t>
+      </w:r>
+      <w:r>
+        <w:rPr>
+          <w:rFonts w:ascii="Times New Roman" w:cs="Times New Roman" w:eastAsia="Times New Roman" w:hAnsi="Times New Roman"/>
+          <w:b/>
+          <w:bCs/>
+          <w:i w:val="false"/>
+          <w:iCs w:val="false"/>
+          <w:color w:val="000000"/>
+          <w:sz w:val="24"/>
+          <w:szCs w:val="24"/>
+        </w:rPr>
+        <w:t xml:space="preserve">Le volume mesure la place occupée dans l’espace, en m³, dm³, cm³. La contenance mesure ce qu’un récipient peut contenir, en L, cL, mL. Les deux systèmes sont reliés par : 1 L = 1 dm³, 1 mL = 1 cm³ et 1 000 L = 1 m³.</w:t>
+      </w:r>
+    </w:p>
+    <w:p>
+      <w:pPr>
+        <w:spacing w:after="110" w:line="300"/>
+        <w:jc w:val="both"/>
+      </w:pPr>
+      <w:r>
+        <w:rPr>
+          <w:rFonts w:ascii="Times New Roman" w:cs="Times New Roman" w:eastAsia="Times New Roman" w:hAnsi="Times New Roman"/>
+          <w:b/>
+          <w:bCs/>
+          <w:i w:val="false"/>
+          <w:iCs w:val="false"/>
+          <w:color w:val="1F4E79"/>
+          <w:sz w:val="24"/>
+          <w:szCs w:val="24"/>
+        </w:rPr>
+        <w:t xml:space="preserve">Autrement dit : </w:t>
+      </w:r>
+      <w:r>
+        <w:rPr>
+          <w:rFonts w:ascii="Times New Roman" w:cs="Times New Roman" w:eastAsia="Times New Roman" w:hAnsi="Times New Roman"/>
+          <w:b w:val="false"/>
+          <w:bCs w:val="false"/>
+          <w:i w:val="false"/>
+          <w:iCs w:val="false"/>
+          <w:color w:val="000000"/>
+          <w:sz w:val="24"/>
+          <w:szCs w:val="24"/>
+        </w:rPr>
+        <w:t xml:space="preserve">un litre, c’est exactement le contenu d’un cube de 1 dm de côté ; un millilitre, celui d’un petit cube de 1 cm.</w:t>
+      </w:r>
+    </w:p>
+    <w:p>
+      <w:pPr>
+        <w:spacing w:after="110" w:line="300"/>
+        <w:jc w:val="both"/>
+      </w:pPr>
+      <w:r>
+        <w:rPr>
+          <w:rFonts w:ascii="Times New Roman" w:cs="Times New Roman" w:eastAsia="Times New Roman" w:hAnsi="Times New Roman"/>
+          <w:b w:val="false"/>
+          <w:bCs w:val="false"/>
+          <w:i w:val="false"/>
+          <w:iCs w:val="false"/>
+          <w:color w:val="000000"/>
+          <w:sz w:val="24"/>
+          <w:szCs w:val="24"/>
+        </w:rPr>
+        <w:t xml:space="preserve">Les unités de volume vont de 1 000 en 1 000 : 1 m³ = 1 000 dm³ et 1 dm³ = 1 000 cm³, car un cube de 10 sur 10 sur 10 contient 10 × 10 × 10 = 1 000 petits cubes. Le pont entre les deux familles passe par le litre : réservoir de 2 m³ = 2 000 L ; seringue de 5 mL = 5 cm³.</w:t>
+      </w:r>
+    </w:p>
+    <w:p>
+      <w:pPr>
+        <w:spacing w:after="120" w:before="120"/>
+        <w:jc w:val="center"/>
+      </w:pPr>
+      <w:r>
+        <w:drawing>
+          <wp:inline distT="0" distB="0" distL="0" distR="0">
+            <wp:extent cx="4762500" cy="2362200"/>
+            <wp:effectExtent t="0" r="0" b="0" l="0"/>
+            <wp:docPr id="24" name="" descr="" title=""/>
+            <wp:cNvGraphicFramePr>
+              <a:graphicFrameLocks xmlns:a="http://schemas.openxmlformats.org/drawingml/2006/main" noChangeAspect="1"/>
+            </wp:cNvGraphicFramePr>
+            <a:graphic xmlns:a="http://schemas.openxmlformats.org/drawingml/2006/main">
+              <a:graphicData uri="http://schemas.openxmlformats.org/drawingml/2006/picture">
+                <pic:pic xmlns:pic="http://schemas.openxmlformats.org/drawingml/2006/picture">
+                  <pic:nvPicPr>
+                    <pic:cNvPr id="0" name="" descr=""/>
+                    <pic:cNvPicPr>
+                      <a:picLocks noChangeAspect="1" noChangeArrowheads="1"/>
+                    </pic:cNvPicPr>
+                  </pic:nvPicPr>
+                  <pic:blipFill>
+                    <a:blip r:embed="rId32" cstate="none"/>
                     <a:srcRect/>
                     <a:stretch>
                       <a:fillRect/>
@@ -36894,98 +37446,15 @@
     </w:p>
     <w:p>
       <w:pPr>
-        <w:spacing w:after="110" w:line="300"/>
-        <w:jc w:val="both"/>
-      </w:pPr>
-      <w:r>
-        <w:rPr>
-          <w:rFonts w:ascii="Times New Roman" w:cs="Times New Roman" w:eastAsia="Times New Roman" w:hAnsi="Times New Roman"/>
-          <w:b/>
-          <w:bCs/>
-          <w:i w:val="false"/>
-          <w:iCs w:val="false"/>
-          <w:color w:val="2E7D32"/>
-          <w:sz w:val="24"/>
-          <w:szCs w:val="24"/>
-        </w:rPr>
-        <w:t xml:space="preserve">Définition — </w:t>
-      </w:r>
-      <w:r>
-        <w:rPr>
-          <w:rFonts w:ascii="Times New Roman" w:cs="Times New Roman" w:eastAsia="Times New Roman" w:hAnsi="Times New Roman"/>
-          <w:b/>
-          <w:bCs/>
-          <w:i w:val="false"/>
-          <w:iCs w:val="false"/>
-          <w:color w:val="000000"/>
-          <w:sz w:val="24"/>
-          <w:szCs w:val="24"/>
-        </w:rPr>
-        <w:t xml:space="preserve">Dans le tableau des volumes (m³, dm³, cm³), chaque unité vaut 1 000 fois la suivante : chaque colonne de volume contient donc trois chiffres. Les litres s’insèrent dans ce tableau grâce à 1 L = 1 dm³.</w:t>
-      </w:r>
-    </w:p>
-    <w:p>
-      <w:pPr>
-        <w:spacing w:after="110" w:line="300"/>
-        <w:jc w:val="both"/>
-      </w:pPr>
-      <w:r>
-        <w:rPr>
-          <w:rFonts w:ascii="Times New Roman" w:cs="Times New Roman" w:eastAsia="Times New Roman" w:hAnsi="Times New Roman"/>
-          <w:b/>
-          <w:bCs/>
-          <w:i w:val="false"/>
-          <w:iCs w:val="false"/>
-          <w:color w:val="1F4E79"/>
-          <w:sz w:val="24"/>
-          <w:szCs w:val="24"/>
-        </w:rPr>
-        <w:t xml:space="preserve">Autrement dit : </w:t>
-      </w:r>
-      <w:r>
-        <w:rPr>
-          <w:rFonts w:ascii="Times New Roman" w:cs="Times New Roman" w:eastAsia="Times New Roman" w:hAnsi="Times New Roman"/>
-          <w:b w:val="false"/>
-          <w:bCs w:val="false"/>
-          <w:i w:val="false"/>
-          <w:iCs w:val="false"/>
-          <w:color w:val="000000"/>
-          <w:sz w:val="24"/>
-          <w:szCs w:val="24"/>
-        </w:rPr>
-        <w:t xml:space="preserve">volume : trois rangs de virgule par colonne ; on accroche les litres sur la colonne des dm³.</w:t>
-      </w:r>
-    </w:p>
-    <w:p>
-      <w:pPr>
-        <w:spacing w:after="110" w:line="300"/>
-        <w:jc w:val="both"/>
-      </w:pPr>
-      <w:r>
-        <w:rPr>
-          <w:rFonts w:ascii="Times New Roman" w:cs="Times New Roman" w:eastAsia="Times New Roman" w:hAnsi="Times New Roman"/>
-          <w:b w:val="false"/>
-          <w:bCs w:val="false"/>
-          <w:i w:val="false"/>
-          <w:iCs w:val="false"/>
-          <w:color w:val="000000"/>
-          <w:sz w:val="24"/>
-          <w:szCs w:val="24"/>
-        </w:rPr>
-        <w:t xml:space="preserve">Pour convertir, on écrit le nombre dans le tableau en donnant trois chiffres à chaque colonne, puis on déplace la virgule de trois rangs par colonne : 2,4 m³ = 2 400 dm³ = 2 400 L, et 350 mL = 350 cm³ = 0,35 dm³ = 0,35 L. Dans le sens inverse, 12 m³ = 12 000 L, soit 12 000 ÷ 20 = 600 bidons de 20 L.</w:t>
-      </w:r>
-    </w:p>
-    <w:p>
-      <w:pPr>
         <w:spacing w:after="120" w:before="120"/>
         <w:jc w:val="center"/>
       </w:pPr>
       <w:r>
         <w:drawing>
           <wp:inline distT="0" distB="0" distL="0" distR="0">
-            <wp:extent cx="4762500" cy="2352675"/>
+            <wp:extent cx="4095750" cy="2286000"/>
             <wp:effectExtent t="0" r="0" b="0" l="0"/>
-            <wp:docPr id="13" name="" descr="" title=""/>
+            <wp:docPr id="25" name="" descr="" title=""/>
             <wp:cNvGraphicFramePr>
               <a:graphicFrameLocks xmlns:a="http://schemas.openxmlformats.org/drawingml/2006/main" noChangeAspect="1"/>
             </wp:cNvGraphicFramePr>
@@ -36999,7 +37468,136 @@
                     </pic:cNvPicPr>
                   </pic:nvPicPr>
                   <pic:blipFill>
-                    <a:blip r:embed="rId21" cstate="none"/>
+                    <a:blip r:embed="rId33" cstate="none"/>
+                    <a:srcRect/>
+                    <a:stretch>
+                      <a:fillRect/>
+                    </a:stretch>
+                  </pic:blipFill>
+                  <pic:spPr bwMode="auto">
+                    <a:xfrm>
+                      <a:off x="0" y="0"/>
+                      <a:ext cx="4095750" cy="2286000"/>
+                    </a:xfrm>
+                    <a:prstGeom prst="rect">
+                      <a:avLst/>
+                    </a:prstGeom>
+                  </pic:spPr>
+                </pic:pic>
+              </a:graphicData>
+            </a:graphic>
+          </wp:inline>
+        </w:drawing>
+      </w:r>
+    </w:p>
+    <w:p>
+      <w:pPr>
+        <w:spacing w:after="110" w:line="300"/>
+        <w:jc w:val="both"/>
+      </w:pPr>
+      <w:r>
+        <w:rPr>
+          <w:rFonts w:ascii="Times New Roman" w:cs="Times New Roman" w:eastAsia="Times New Roman" w:hAnsi="Times New Roman"/>
+          <w:b/>
+          <w:bCs/>
+          <w:i w:val="false"/>
+          <w:iCs w:val="false"/>
+          <w:color w:val="2E7D32"/>
+          <w:sz w:val="24"/>
+          <w:szCs w:val="24"/>
+        </w:rPr>
+        <w:t xml:space="preserve">Définition — </w:t>
+      </w:r>
+      <w:r>
+        <w:rPr>
+          <w:rFonts w:ascii="Times New Roman" w:cs="Times New Roman" w:eastAsia="Times New Roman" w:hAnsi="Times New Roman"/>
+          <w:b/>
+          <w:bCs/>
+          <w:i w:val="false"/>
+          <w:iCs w:val="false"/>
+          <w:color w:val="000000"/>
+          <w:sz w:val="24"/>
+          <w:szCs w:val="24"/>
+        </w:rPr>
+        <w:t xml:space="preserve">Dans le tableau des volumes (m³, dm³, cm³), chaque unité vaut 1 000 fois la suivante : chaque colonne de volume contient donc trois chiffres. Les litres s’insèrent dans ce tableau grâce à 1 L = 1 dm³.</w:t>
+      </w:r>
+    </w:p>
+    <w:p>
+      <w:pPr>
+        <w:spacing w:after="110" w:line="300"/>
+        <w:jc w:val="both"/>
+      </w:pPr>
+      <w:r>
+        <w:rPr>
+          <w:rFonts w:ascii="Times New Roman" w:cs="Times New Roman" w:eastAsia="Times New Roman" w:hAnsi="Times New Roman"/>
+          <w:b/>
+          <w:bCs/>
+          <w:i w:val="false"/>
+          <w:iCs w:val="false"/>
+          <w:color w:val="1F4E79"/>
+          <w:sz w:val="24"/>
+          <w:szCs w:val="24"/>
+        </w:rPr>
+        <w:t xml:space="preserve">Autrement dit : </w:t>
+      </w:r>
+      <w:r>
+        <w:rPr>
+          <w:rFonts w:ascii="Times New Roman" w:cs="Times New Roman" w:eastAsia="Times New Roman" w:hAnsi="Times New Roman"/>
+          <w:b w:val="false"/>
+          <w:bCs w:val="false"/>
+          <w:i w:val="false"/>
+          <w:iCs w:val="false"/>
+          <w:color w:val="000000"/>
+          <w:sz w:val="24"/>
+          <w:szCs w:val="24"/>
+        </w:rPr>
+        <w:t xml:space="preserve">volume : trois rangs de virgule par colonne ; on accroche les litres sur la colonne des dm³.</w:t>
+      </w:r>
+    </w:p>
+    <w:p>
+      <w:pPr>
+        <w:spacing w:after="110" w:line="300"/>
+        <w:jc w:val="both"/>
+      </w:pPr>
+      <w:r>
+        <w:rPr>
+          <w:rFonts w:ascii="Times New Roman" w:cs="Times New Roman" w:eastAsia="Times New Roman" w:hAnsi="Times New Roman"/>
+          <w:b w:val="false"/>
+          <w:bCs w:val="false"/>
+          <w:i w:val="false"/>
+          <w:iCs w:val="false"/>
+          <w:color w:val="000000"/>
+          <w:sz w:val="24"/>
+          <w:szCs w:val="24"/>
+        </w:rPr>
+        <w:t xml:space="preserve">Pour convertir, on écrit le nombre dans le tableau en donnant trois chiffres à chaque colonne, puis on déplace la virgule de trois rangs par colonne : 2,4 m³ = 2 400 dm³ = 2 400 L, et 350 mL = 350 cm³ = 0,35 dm³ = 0,35 L. Dans le sens inverse, 12 m³ = 12 000 L, soit 12 000 ÷ 20 = 600 bidons de 20 L.</w:t>
+      </w:r>
+    </w:p>
+    <w:p>
+      <w:pPr>
+        <w:spacing w:after="120" w:before="120"/>
+        <w:jc w:val="center"/>
+      </w:pPr>
+      <w:r>
+        <w:drawing>
+          <wp:inline distT="0" distB="0" distL="0" distR="0">
+            <wp:extent cx="4762500" cy="2352675"/>
+            <wp:effectExtent t="0" r="0" b="0" l="0"/>
+            <wp:docPr id="26" name="" descr="" title=""/>
+            <wp:cNvGraphicFramePr>
+              <a:graphicFrameLocks xmlns:a="http://schemas.openxmlformats.org/drawingml/2006/main" noChangeAspect="1"/>
+            </wp:cNvGraphicFramePr>
+            <a:graphic xmlns:a="http://schemas.openxmlformats.org/drawingml/2006/main">
+              <a:graphicData uri="http://schemas.openxmlformats.org/drawingml/2006/picture">
+                <pic:pic xmlns:pic="http://schemas.openxmlformats.org/drawingml/2006/picture">
+                  <pic:nvPicPr>
+                    <pic:cNvPr id="0" name="" descr=""/>
+                    <pic:cNvPicPr>
+                      <a:picLocks noChangeAspect="1" noChangeArrowheads="1"/>
+                    </pic:cNvPicPr>
+                  </pic:nvPicPr>
+                  <pic:blipFill>
+                    <a:blip r:embed="rId34" cstate="none"/>
                     <a:srcRect/>
                     <a:stretch>
                       <a:fillRect/>

</xml_diff>